<commit_message>
Cambios presentación (discusiones y visualizaciones) y ajustes procesamientos cfa/invarianza
</commit_message>
<xml_diff>
--- a/output/figures/tables/invariance_table_country.docx
+++ b/output/figures/tables/invariance_table_country.docx
@@ -25,7 +25,7 @@
         <w:gridCol w:w="569"/>
         <w:gridCol w:w="773"/>
         <w:gridCol w:w="667"/>
-        <w:gridCol w:w="660"/>
+        <w:gridCol w:w="569"/>
         <w:gridCol w:w="462"/>
         <w:gridCol w:w="754"/>
         <w:gridCol w:w="891"/>
@@ -3244,277 +3244,277 @@
                 <w:szCs w:val="16"/>
                 <w:color w:val="000000"/>
               </w:rPr>
-              <w:t xml:space="preserve">29,338</w:t>
-            </w:r>
-          </w:p>
-        </w:tc>
-        <w:tc>
-          <w:tcPr>
-            <w:tcBorders>
-              <w:bottom w:val="none" w:sz="0" w:space="0" w:color="000000"/>
-              <w:top w:val="none" w:sz="0" w:space="0" w:color="000000"/>
-              <w:left w:val="none" w:sz="0" w:space="0" w:color="000000"/>
-              <w:right w:val="none" w:sz="0" w:space="0" w:color="000000"/>
-            </w:tcBorders>
-            <w:shd w:val="clear" w:color="auto" w:fill="FFFFFF"/>
-            <w:tcMar>
-              <w:top w:w="0" w:type="dxa"/>
-              <w:bottom w:w="0" w:type="dxa"/>
-              <w:left w:w="0" w:type="dxa"/>
-              <w:right w:w="0" w:type="dxa"/>
-            </w:tcMar>
-            <w:vAlign w:val="center"/>
-          </w:tcPr>
-          <w:p>
-            <w:pPr>
-              <w:jc w:val="center"/>
-              <w:pBdr>
-                <w:bottom w:val="none" w:sz="0" w:space="0" w:color="000000"/>
-                <w:top w:val="none" w:sz="0" w:space="0" w:color="000000"/>
-                <w:left w:val="none" w:sz="0" w:space="0" w:color="000000"/>
-                <w:right w:val="none" w:sz="0" w:space="0" w:color="000000"/>
-              </w:pBdr>
-              <w:spacing w:after="60" w:before="60" w:line="240"/>
-              <w:ind w:left="60" w:right="60" w:firstLine="0" w:firstLineChars="0"/>
-              <w:rPr>
-                <w:rFonts w:ascii="Calibri" w:hAnsi="Calibri" w:eastAsia="Calibri" w:cs="Calibri"/>
-                <w:i w:val="false"/>
-                <w:b w:val="false"/>
-                <w:u w:val="none"/>
-                <w:strike w:val="false"/>
-                <w:sz w:val="16"/>
-                <w:szCs w:val="16"/>
-                <w:color w:val="000000"/>
-              </w:rPr>
-            </w:pPr>
-            <w:r>
-              <w:rPr>
-                <w:rFonts w:ascii="Calibri" w:hAnsi="Calibri" w:eastAsia="Calibri" w:cs="Calibri"/>
-                <w:i w:val="false"/>
-                <w:b w:val="false"/>
-                <w:u w:val="none"/>
-                <w:strike w:val="false"/>
-                <w:sz w:val="16"/>
-                <w:szCs w:val="16"/>
-                <w:color w:val="000000"/>
-              </w:rPr>
-              <w:t xml:space="preserve">946</w:t>
-            </w:r>
-          </w:p>
-        </w:tc>
-        <w:tc>
-          <w:tcPr>
-            <w:tcBorders>
-              <w:bottom w:val="none" w:sz="0" w:space="0" w:color="000000"/>
-              <w:top w:val="none" w:sz="0" w:space="0" w:color="000000"/>
-              <w:left w:val="none" w:sz="0" w:space="0" w:color="000000"/>
-              <w:right w:val="none" w:sz="0" w:space="0" w:color="000000"/>
-            </w:tcBorders>
-            <w:shd w:val="clear" w:color="auto" w:fill="FFFFFF"/>
-            <w:tcMar>
-              <w:top w:w="0" w:type="dxa"/>
-              <w:bottom w:w="0" w:type="dxa"/>
-              <w:left w:w="0" w:type="dxa"/>
-              <w:right w:w="0" w:type="dxa"/>
-            </w:tcMar>
-            <w:vAlign w:val="center"/>
-          </w:tcPr>
-          <w:p>
-            <w:pPr>
-              <w:jc w:val="center"/>
-              <w:pBdr>
-                <w:bottom w:val="none" w:sz="0" w:space="0" w:color="000000"/>
-                <w:top w:val="none" w:sz="0" w:space="0" w:color="000000"/>
-                <w:left w:val="none" w:sz="0" w:space="0" w:color="000000"/>
-                <w:right w:val="none" w:sz="0" w:space="0" w:color="000000"/>
-              </w:pBdr>
-              <w:spacing w:after="60" w:before="60" w:line="240"/>
-              <w:ind w:left="60" w:right="60" w:firstLine="0" w:firstLineChars="0"/>
-              <w:rPr>
-                <w:rFonts w:ascii="Calibri" w:hAnsi="Calibri" w:eastAsia="Calibri" w:cs="Calibri"/>
-                <w:i w:val="false"/>
-                <w:b w:val="false"/>
-                <w:u w:val="none"/>
-                <w:strike w:val="false"/>
-                <w:sz w:val="16"/>
-                <w:szCs w:val="16"/>
-                <w:color w:val="000000"/>
-              </w:rPr>
-            </w:pPr>
-            <w:r>
-              <w:rPr>
-                <w:rFonts w:ascii="Calibri" w:hAnsi="Calibri" w:eastAsia="Calibri" w:cs="Calibri"/>
-                <w:i w:val="false"/>
-                <w:b w:val="false"/>
-                <w:u w:val="none"/>
-                <w:strike w:val="false"/>
-                <w:sz w:val="16"/>
-                <w:szCs w:val="16"/>
-                <w:color w:val="000000"/>
-              </w:rPr>
-              <w:t xml:space="preserve">0.980</w:t>
-            </w:r>
-          </w:p>
-        </w:tc>
-        <w:tc>
-          <w:tcPr>
-            <w:tcBorders>
-              <w:bottom w:val="none" w:sz="0" w:space="0" w:color="000000"/>
-              <w:top w:val="none" w:sz="0" w:space="0" w:color="000000"/>
-              <w:left w:val="none" w:sz="0" w:space="0" w:color="000000"/>
-              <w:right w:val="none" w:sz="0" w:space="0" w:color="000000"/>
-            </w:tcBorders>
-            <w:shd w:val="clear" w:color="auto" w:fill="FFFFFF"/>
-            <w:tcMar>
-              <w:top w:w="0" w:type="dxa"/>
-              <w:bottom w:w="0" w:type="dxa"/>
-              <w:left w:w="0" w:type="dxa"/>
-              <w:right w:w="0" w:type="dxa"/>
-            </w:tcMar>
-            <w:vAlign w:val="center"/>
-          </w:tcPr>
-          <w:p>
-            <w:pPr>
-              <w:jc w:val="center"/>
-              <w:pBdr>
-                <w:bottom w:val="none" w:sz="0" w:space="0" w:color="000000"/>
-                <w:top w:val="none" w:sz="0" w:space="0" w:color="000000"/>
-                <w:left w:val="none" w:sz="0" w:space="0" w:color="000000"/>
-                <w:right w:val="none" w:sz="0" w:space="0" w:color="000000"/>
-              </w:pBdr>
-              <w:spacing w:after="60" w:before="60" w:line="240"/>
-              <w:ind w:left="60" w:right="60" w:firstLine="0" w:firstLineChars="0"/>
-              <w:rPr>
-                <w:rFonts w:ascii="Calibri" w:hAnsi="Calibri" w:eastAsia="Calibri" w:cs="Calibri"/>
-                <w:i w:val="false"/>
-                <w:b w:val="false"/>
-                <w:u w:val="none"/>
-                <w:strike w:val="false"/>
-                <w:sz w:val="16"/>
-                <w:szCs w:val="16"/>
-                <w:color w:val="000000"/>
-              </w:rPr>
-            </w:pPr>
-            <w:r>
-              <w:rPr>
-                <w:rFonts w:ascii="Calibri" w:hAnsi="Calibri" w:eastAsia="Calibri" w:cs="Calibri"/>
-                <w:i w:val="false"/>
-                <w:b w:val="false"/>
-                <w:u w:val="none"/>
-                <w:strike w:val="false"/>
-                <w:sz w:val="16"/>
-                <w:szCs w:val="16"/>
-                <w:color w:val="000000"/>
-              </w:rPr>
-              <w:t xml:space="preserve">0.974</w:t>
-            </w:r>
-          </w:p>
-        </w:tc>
-        <w:tc>
-          <w:tcPr>
-            <w:tcBorders>
-              <w:bottom w:val="none" w:sz="0" w:space="0" w:color="000000"/>
-              <w:top w:val="none" w:sz="0" w:space="0" w:color="000000"/>
-              <w:left w:val="none" w:sz="0" w:space="0" w:color="000000"/>
-              <w:right w:val="none" w:sz="0" w:space="0" w:color="000000"/>
-            </w:tcBorders>
-            <w:shd w:val="clear" w:color="auto" w:fill="FFFFFF"/>
-            <w:tcMar>
-              <w:top w:w="0" w:type="dxa"/>
-              <w:bottom w:w="0" w:type="dxa"/>
-              <w:left w:w="0" w:type="dxa"/>
-              <w:right w:w="0" w:type="dxa"/>
-            </w:tcMar>
-            <w:vAlign w:val="center"/>
-          </w:tcPr>
-          <w:p>
-            <w:pPr>
-              <w:jc w:val="center"/>
-              <w:pBdr>
-                <w:bottom w:val="none" w:sz="0" w:space="0" w:color="000000"/>
-                <w:top w:val="none" w:sz="0" w:space="0" w:color="000000"/>
-                <w:left w:val="none" w:sz="0" w:space="0" w:color="000000"/>
-                <w:right w:val="none" w:sz="0" w:space="0" w:color="000000"/>
-              </w:pBdr>
-              <w:spacing w:after="60" w:before="60" w:line="240"/>
-              <w:ind w:left="60" w:right="60" w:firstLine="0" w:firstLineChars="0"/>
-              <w:rPr>
-                <w:rFonts w:ascii="Calibri" w:hAnsi="Calibri" w:eastAsia="Calibri" w:cs="Calibri"/>
-                <w:i w:val="false"/>
-                <w:b w:val="false"/>
-                <w:u w:val="none"/>
-                <w:strike w:val="false"/>
-                <w:sz w:val="16"/>
-                <w:szCs w:val="16"/>
-                <w:color w:val="000000"/>
-              </w:rPr>
-            </w:pPr>
-            <w:r>
-              <w:rPr>
-                <w:rFonts w:ascii="Calibri" w:hAnsi="Calibri" w:eastAsia="Calibri" w:cs="Calibri"/>
-                <w:i w:val="false"/>
-                <w:b w:val="false"/>
-                <w:u w:val="none"/>
-                <w:strike w:val="false"/>
-                <w:sz w:val="16"/>
-                <w:szCs w:val="16"/>
-                <w:color w:val="000000"/>
-              </w:rPr>
-              <w:t xml:space="preserve">0.094</w:t>
-            </w:r>
-          </w:p>
-        </w:tc>
-        <w:tc>
-          <w:tcPr>
-            <w:tcBorders>
-              <w:bottom w:val="none" w:sz="0" w:space="0" w:color="000000"/>
-              <w:top w:val="none" w:sz="0" w:space="0" w:color="000000"/>
-              <w:left w:val="none" w:sz="0" w:space="0" w:color="000000"/>
-              <w:right w:val="none" w:sz="0" w:space="0" w:color="000000"/>
-            </w:tcBorders>
-            <w:shd w:val="clear" w:color="auto" w:fill="FFFFFF"/>
-            <w:tcMar>
-              <w:top w:w="0" w:type="dxa"/>
-              <w:bottom w:w="0" w:type="dxa"/>
-              <w:left w:w="0" w:type="dxa"/>
-              <w:right w:w="0" w:type="dxa"/>
-            </w:tcMar>
-            <w:vAlign w:val="center"/>
-          </w:tcPr>
-          <w:p>
-            <w:pPr>
-              <w:jc w:val="center"/>
-              <w:pBdr>
-                <w:bottom w:val="none" w:sz="0" w:space="0" w:color="000000"/>
-                <w:top w:val="none" w:sz="0" w:space="0" w:color="000000"/>
-                <w:left w:val="none" w:sz="0" w:space="0" w:color="000000"/>
-                <w:right w:val="none" w:sz="0" w:space="0" w:color="000000"/>
-              </w:pBdr>
-              <w:spacing w:after="60" w:before="60" w:line="240"/>
-              <w:ind w:left="60" w:right="60" w:firstLine="0" w:firstLineChars="0"/>
-              <w:rPr>
-                <w:rFonts w:ascii="Calibri" w:hAnsi="Calibri" w:eastAsia="Calibri" w:cs="Calibri"/>
-                <w:i w:val="false"/>
-                <w:b w:val="false"/>
-                <w:u w:val="none"/>
-                <w:strike w:val="false"/>
-                <w:sz w:val="16"/>
-                <w:szCs w:val="16"/>
-                <w:color w:val="000000"/>
-              </w:rPr>
-            </w:pPr>
-            <w:r>
-              <w:rPr>
-                <w:rFonts w:ascii="Calibri" w:hAnsi="Calibri" w:eastAsia="Calibri" w:cs="Calibri"/>
-                <w:i w:val="false"/>
-                <w:b w:val="false"/>
-                <w:u w:val="none"/>
-                <w:strike w:val="false"/>
-                <w:sz w:val="16"/>
-                <w:szCs w:val="16"/>
-                <w:color w:val="000000"/>
-              </w:rPr>
-              <w:t xml:space="preserve">0.076</w:t>
+              <w:t xml:space="preserve">15,273</w:t>
+            </w:r>
+          </w:p>
+        </w:tc>
+        <w:tc>
+          <w:tcPr>
+            <w:tcBorders>
+              <w:bottom w:val="none" w:sz="0" w:space="0" w:color="000000"/>
+              <w:top w:val="none" w:sz="0" w:space="0" w:color="000000"/>
+              <w:left w:val="none" w:sz="0" w:space="0" w:color="000000"/>
+              <w:right w:val="none" w:sz="0" w:space="0" w:color="000000"/>
+            </w:tcBorders>
+            <w:shd w:val="clear" w:color="auto" w:fill="FFFFFF"/>
+            <w:tcMar>
+              <w:top w:w="0" w:type="dxa"/>
+              <w:bottom w:w="0" w:type="dxa"/>
+              <w:left w:w="0" w:type="dxa"/>
+              <w:right w:w="0" w:type="dxa"/>
+            </w:tcMar>
+            <w:vAlign w:val="center"/>
+          </w:tcPr>
+          <w:p>
+            <w:pPr>
+              <w:jc w:val="center"/>
+              <w:pBdr>
+                <w:bottom w:val="none" w:sz="0" w:space="0" w:color="000000"/>
+                <w:top w:val="none" w:sz="0" w:space="0" w:color="000000"/>
+                <w:left w:val="none" w:sz="0" w:space="0" w:color="000000"/>
+                <w:right w:val="none" w:sz="0" w:space="0" w:color="000000"/>
+              </w:pBdr>
+              <w:spacing w:after="60" w:before="60" w:line="240"/>
+              <w:ind w:left="60" w:right="60" w:firstLine="0" w:firstLineChars="0"/>
+              <w:rPr>
+                <w:rFonts w:ascii="Calibri" w:hAnsi="Calibri" w:eastAsia="Calibri" w:cs="Calibri"/>
+                <w:i w:val="false"/>
+                <w:b w:val="false"/>
+                <w:u w:val="none"/>
+                <w:strike w:val="false"/>
+                <w:sz w:val="16"/>
+                <w:szCs w:val="16"/>
+                <w:color w:val="000000"/>
+              </w:rPr>
+            </w:pPr>
+            <w:r>
+              <w:rPr>
+                <w:rFonts w:ascii="Calibri" w:hAnsi="Calibri" w:eastAsia="Calibri" w:cs="Calibri"/>
+                <w:i w:val="false"/>
+                <w:b w:val="false"/>
+                <w:u w:val="none"/>
+                <w:strike w:val="false"/>
+                <w:sz w:val="16"/>
+                <w:szCs w:val="16"/>
+                <w:color w:val="000000"/>
+              </w:rPr>
+              <w:t xml:space="preserve">572</w:t>
+            </w:r>
+          </w:p>
+        </w:tc>
+        <w:tc>
+          <w:tcPr>
+            <w:tcBorders>
+              <w:bottom w:val="none" w:sz="0" w:space="0" w:color="000000"/>
+              <w:top w:val="none" w:sz="0" w:space="0" w:color="000000"/>
+              <w:left w:val="none" w:sz="0" w:space="0" w:color="000000"/>
+              <w:right w:val="none" w:sz="0" w:space="0" w:color="000000"/>
+            </w:tcBorders>
+            <w:shd w:val="clear" w:color="auto" w:fill="FFFFFF"/>
+            <w:tcMar>
+              <w:top w:w="0" w:type="dxa"/>
+              <w:bottom w:w="0" w:type="dxa"/>
+              <w:left w:w="0" w:type="dxa"/>
+              <w:right w:w="0" w:type="dxa"/>
+            </w:tcMar>
+            <w:vAlign w:val="center"/>
+          </w:tcPr>
+          <w:p>
+            <w:pPr>
+              <w:jc w:val="center"/>
+              <w:pBdr>
+                <w:bottom w:val="none" w:sz="0" w:space="0" w:color="000000"/>
+                <w:top w:val="none" w:sz="0" w:space="0" w:color="000000"/>
+                <w:left w:val="none" w:sz="0" w:space="0" w:color="000000"/>
+                <w:right w:val="none" w:sz="0" w:space="0" w:color="000000"/>
+              </w:pBdr>
+              <w:spacing w:after="60" w:before="60" w:line="240"/>
+              <w:ind w:left="60" w:right="60" w:firstLine="0" w:firstLineChars="0"/>
+              <w:rPr>
+                <w:rFonts w:ascii="Calibri" w:hAnsi="Calibri" w:eastAsia="Calibri" w:cs="Calibri"/>
+                <w:i w:val="false"/>
+                <w:b w:val="false"/>
+                <w:u w:val="none"/>
+                <w:strike w:val="false"/>
+                <w:sz w:val="16"/>
+                <w:szCs w:val="16"/>
+                <w:color w:val="000000"/>
+              </w:rPr>
+            </w:pPr>
+            <w:r>
+              <w:rPr>
+                <w:rFonts w:ascii="Calibri" w:hAnsi="Calibri" w:eastAsia="Calibri" w:cs="Calibri"/>
+                <w:i w:val="false"/>
+                <w:b w:val="false"/>
+                <w:u w:val="none"/>
+                <w:strike w:val="false"/>
+                <w:sz w:val="16"/>
+                <w:szCs w:val="16"/>
+                <w:color w:val="000000"/>
+              </w:rPr>
+              <w:t xml:space="preserve">0.987</w:t>
+            </w:r>
+          </w:p>
+        </w:tc>
+        <w:tc>
+          <w:tcPr>
+            <w:tcBorders>
+              <w:bottom w:val="none" w:sz="0" w:space="0" w:color="000000"/>
+              <w:top w:val="none" w:sz="0" w:space="0" w:color="000000"/>
+              <w:left w:val="none" w:sz="0" w:space="0" w:color="000000"/>
+              <w:right w:val="none" w:sz="0" w:space="0" w:color="000000"/>
+            </w:tcBorders>
+            <w:shd w:val="clear" w:color="auto" w:fill="FFFFFF"/>
+            <w:tcMar>
+              <w:top w:w="0" w:type="dxa"/>
+              <w:bottom w:w="0" w:type="dxa"/>
+              <w:left w:w="0" w:type="dxa"/>
+              <w:right w:w="0" w:type="dxa"/>
+            </w:tcMar>
+            <w:vAlign w:val="center"/>
+          </w:tcPr>
+          <w:p>
+            <w:pPr>
+              <w:jc w:val="center"/>
+              <w:pBdr>
+                <w:bottom w:val="none" w:sz="0" w:space="0" w:color="000000"/>
+                <w:top w:val="none" w:sz="0" w:space="0" w:color="000000"/>
+                <w:left w:val="none" w:sz="0" w:space="0" w:color="000000"/>
+                <w:right w:val="none" w:sz="0" w:space="0" w:color="000000"/>
+              </w:pBdr>
+              <w:spacing w:after="60" w:before="60" w:line="240"/>
+              <w:ind w:left="60" w:right="60" w:firstLine="0" w:firstLineChars="0"/>
+              <w:rPr>
+                <w:rFonts w:ascii="Calibri" w:hAnsi="Calibri" w:eastAsia="Calibri" w:cs="Calibri"/>
+                <w:i w:val="false"/>
+                <w:b w:val="false"/>
+                <w:u w:val="none"/>
+                <w:strike w:val="false"/>
+                <w:sz w:val="16"/>
+                <w:szCs w:val="16"/>
+                <w:color w:val="000000"/>
+              </w:rPr>
+            </w:pPr>
+            <w:r>
+              <w:rPr>
+                <w:rFonts w:ascii="Calibri" w:hAnsi="Calibri" w:eastAsia="Calibri" w:cs="Calibri"/>
+                <w:i w:val="false"/>
+                <w:b w:val="false"/>
+                <w:u w:val="none"/>
+                <w:strike w:val="false"/>
+                <w:sz w:val="16"/>
+                <w:szCs w:val="16"/>
+                <w:color w:val="000000"/>
+              </w:rPr>
+              <w:t xml:space="preserve">0.982</w:t>
+            </w:r>
+          </w:p>
+        </w:tc>
+        <w:tc>
+          <w:tcPr>
+            <w:tcBorders>
+              <w:bottom w:val="none" w:sz="0" w:space="0" w:color="000000"/>
+              <w:top w:val="none" w:sz="0" w:space="0" w:color="000000"/>
+              <w:left w:val="none" w:sz="0" w:space="0" w:color="000000"/>
+              <w:right w:val="none" w:sz="0" w:space="0" w:color="000000"/>
+            </w:tcBorders>
+            <w:shd w:val="clear" w:color="auto" w:fill="FFFFFF"/>
+            <w:tcMar>
+              <w:top w:w="0" w:type="dxa"/>
+              <w:bottom w:w="0" w:type="dxa"/>
+              <w:left w:w="0" w:type="dxa"/>
+              <w:right w:w="0" w:type="dxa"/>
+            </w:tcMar>
+            <w:vAlign w:val="center"/>
+          </w:tcPr>
+          <w:p>
+            <w:pPr>
+              <w:jc w:val="center"/>
+              <w:pBdr>
+                <w:bottom w:val="none" w:sz="0" w:space="0" w:color="000000"/>
+                <w:top w:val="none" w:sz="0" w:space="0" w:color="000000"/>
+                <w:left w:val="none" w:sz="0" w:space="0" w:color="000000"/>
+                <w:right w:val="none" w:sz="0" w:space="0" w:color="000000"/>
+              </w:pBdr>
+              <w:spacing w:after="60" w:before="60" w:line="240"/>
+              <w:ind w:left="60" w:right="60" w:firstLine="0" w:firstLineChars="0"/>
+              <w:rPr>
+                <w:rFonts w:ascii="Calibri" w:hAnsi="Calibri" w:eastAsia="Calibri" w:cs="Calibri"/>
+                <w:i w:val="false"/>
+                <w:b w:val="false"/>
+                <w:u w:val="none"/>
+                <w:strike w:val="false"/>
+                <w:sz w:val="16"/>
+                <w:szCs w:val="16"/>
+                <w:color w:val="000000"/>
+              </w:rPr>
+            </w:pPr>
+            <w:r>
+              <w:rPr>
+                <w:rFonts w:ascii="Calibri" w:hAnsi="Calibri" w:eastAsia="Calibri" w:cs="Calibri"/>
+                <w:i w:val="false"/>
+                <w:b w:val="false"/>
+                <w:u w:val="none"/>
+                <w:strike w:val="false"/>
+                <w:sz w:val="16"/>
+                <w:szCs w:val="16"/>
+                <w:color w:val="000000"/>
+              </w:rPr>
+              <w:t xml:space="preserve">0.086</w:t>
+            </w:r>
+          </w:p>
+        </w:tc>
+        <w:tc>
+          <w:tcPr>
+            <w:tcBorders>
+              <w:bottom w:val="none" w:sz="0" w:space="0" w:color="000000"/>
+              <w:top w:val="none" w:sz="0" w:space="0" w:color="000000"/>
+              <w:left w:val="none" w:sz="0" w:space="0" w:color="000000"/>
+              <w:right w:val="none" w:sz="0" w:space="0" w:color="000000"/>
+            </w:tcBorders>
+            <w:shd w:val="clear" w:color="auto" w:fill="FFFFFF"/>
+            <w:tcMar>
+              <w:top w:w="0" w:type="dxa"/>
+              <w:bottom w:w="0" w:type="dxa"/>
+              <w:left w:w="0" w:type="dxa"/>
+              <w:right w:w="0" w:type="dxa"/>
+            </w:tcMar>
+            <w:vAlign w:val="center"/>
+          </w:tcPr>
+          <w:p>
+            <w:pPr>
+              <w:jc w:val="center"/>
+              <w:pBdr>
+                <w:bottom w:val="none" w:sz="0" w:space="0" w:color="000000"/>
+                <w:top w:val="none" w:sz="0" w:space="0" w:color="000000"/>
+                <w:left w:val="none" w:sz="0" w:space="0" w:color="000000"/>
+                <w:right w:val="none" w:sz="0" w:space="0" w:color="000000"/>
+              </w:pBdr>
+              <w:spacing w:after="60" w:before="60" w:line="240"/>
+              <w:ind w:left="60" w:right="60" w:firstLine="0" w:firstLineChars="0"/>
+              <w:rPr>
+                <w:rFonts w:ascii="Calibri" w:hAnsi="Calibri" w:eastAsia="Calibri" w:cs="Calibri"/>
+                <w:i w:val="false"/>
+                <w:b w:val="false"/>
+                <w:u w:val="none"/>
+                <w:strike w:val="false"/>
+                <w:sz w:val="16"/>
+                <w:szCs w:val="16"/>
+                <w:color w:val="000000"/>
+              </w:rPr>
+            </w:pPr>
+            <w:r>
+              <w:rPr>
+                <w:rFonts w:ascii="Calibri" w:hAnsi="Calibri" w:eastAsia="Calibri" w:cs="Calibri"/>
+                <w:i w:val="false"/>
+                <w:b w:val="false"/>
+                <w:u w:val="none"/>
+                <w:strike w:val="false"/>
+                <w:sz w:val="16"/>
+                <w:szCs w:val="16"/>
+                <w:color w:val="000000"/>
+              </w:rPr>
+              <w:t xml:space="preserve">0.066</w:t>
             </w:r>
           </w:p>
         </w:tc>
@@ -3845,7 +3845,7 @@
       </w:tr>
       <w:tr>
         <w:trPr>
-          <w:trHeight w:val="296" w:hRule="auto"/>
+          <w:trHeight w:val="297" w:hRule="auto"/>
         </w:trPr>
         body5
         <w:tc>
@@ -4006,385 +4006,385 @@
                 <w:szCs w:val="16"/>
                 <w:color w:val="000000"/>
               </w:rPr>
-              <w:t xml:space="preserve">32,759</w:t>
-            </w:r>
-          </w:p>
-        </w:tc>
-        <w:tc>
-          <w:tcPr>
-            <w:tcBorders>
-              <w:bottom w:val="none" w:sz="0" w:space="0" w:color="000000"/>
-              <w:top w:val="none" w:sz="0" w:space="0" w:color="000000"/>
-              <w:left w:val="none" w:sz="0" w:space="0" w:color="000000"/>
-              <w:right w:val="none" w:sz="0" w:space="0" w:color="000000"/>
-            </w:tcBorders>
-            <w:shd w:val="clear" w:color="auto" w:fill="FFFFFF"/>
-            <w:tcMar>
-              <w:top w:w="0" w:type="dxa"/>
-              <w:bottom w:w="0" w:type="dxa"/>
-              <w:left w:w="0" w:type="dxa"/>
-              <w:right w:w="0" w:type="dxa"/>
-            </w:tcMar>
-            <w:vAlign w:val="center"/>
-          </w:tcPr>
-          <w:p>
-            <w:pPr>
-              <w:jc w:val="center"/>
-              <w:pBdr>
-                <w:bottom w:val="none" w:sz="0" w:space="0" w:color="000000"/>
-                <w:top w:val="none" w:sz="0" w:space="0" w:color="000000"/>
-                <w:left w:val="none" w:sz="0" w:space="0" w:color="000000"/>
-                <w:right w:val="none" w:sz="0" w:space="0" w:color="000000"/>
-              </w:pBdr>
-              <w:spacing w:after="60" w:before="60" w:line="240"/>
-              <w:ind w:left="60" w:right="60" w:firstLine="0" w:firstLineChars="0"/>
-              <w:rPr>
-                <w:rFonts w:ascii="Calibri" w:hAnsi="Calibri" w:eastAsia="Calibri" w:cs="Calibri"/>
-                <w:i w:val="false"/>
-                <w:b w:val="false"/>
-                <w:u w:val="none"/>
-                <w:strike w:val="false"/>
-                <w:sz w:val="16"/>
-                <w:szCs w:val="16"/>
-                <w:color w:val="000000"/>
-              </w:rPr>
-            </w:pPr>
-            <w:r>
-              <w:rPr>
-                <w:rFonts w:ascii="Calibri" w:hAnsi="Calibri" w:eastAsia="Calibri" w:cs="Calibri"/>
-                <w:i w:val="false"/>
-                <w:b w:val="false"/>
-                <w:u w:val="none"/>
-                <w:strike w:val="false"/>
-                <w:sz w:val="16"/>
-                <w:szCs w:val="16"/>
-                <w:color w:val="000000"/>
-              </w:rPr>
-              <w:t xml:space="preserve">1,135</w:t>
-            </w:r>
-          </w:p>
-        </w:tc>
-        <w:tc>
-          <w:tcPr>
-            <w:tcBorders>
-              <w:bottom w:val="none" w:sz="0" w:space="0" w:color="000000"/>
-              <w:top w:val="none" w:sz="0" w:space="0" w:color="000000"/>
-              <w:left w:val="none" w:sz="0" w:space="0" w:color="000000"/>
-              <w:right w:val="none" w:sz="0" w:space="0" w:color="000000"/>
-            </w:tcBorders>
-            <w:shd w:val="clear" w:color="auto" w:fill="FFFFFF"/>
-            <w:tcMar>
-              <w:top w:w="0" w:type="dxa"/>
-              <w:bottom w:w="0" w:type="dxa"/>
-              <w:left w:w="0" w:type="dxa"/>
-              <w:right w:w="0" w:type="dxa"/>
-            </w:tcMar>
-            <w:vAlign w:val="center"/>
-          </w:tcPr>
-          <w:p>
-            <w:pPr>
-              <w:jc w:val="center"/>
-              <w:pBdr>
-                <w:bottom w:val="none" w:sz="0" w:space="0" w:color="000000"/>
-                <w:top w:val="none" w:sz="0" w:space="0" w:color="000000"/>
-                <w:left w:val="none" w:sz="0" w:space="0" w:color="000000"/>
-                <w:right w:val="none" w:sz="0" w:space="0" w:color="000000"/>
-              </w:pBdr>
-              <w:spacing w:after="60" w:before="60" w:line="240"/>
-              <w:ind w:left="60" w:right="60" w:firstLine="0" w:firstLineChars="0"/>
-              <w:rPr>
-                <w:rFonts w:ascii="Calibri" w:hAnsi="Calibri" w:eastAsia="Calibri" w:cs="Calibri"/>
-                <w:i w:val="false"/>
-                <w:b w:val="false"/>
-                <w:u w:val="none"/>
-                <w:strike w:val="false"/>
-                <w:sz w:val="16"/>
-                <w:szCs w:val="16"/>
-                <w:color w:val="000000"/>
-              </w:rPr>
-            </w:pPr>
-            <w:r>
-              <w:rPr>
-                <w:rFonts w:ascii="Calibri" w:hAnsi="Calibri" w:eastAsia="Calibri" w:cs="Calibri"/>
-                <w:i w:val="false"/>
-                <w:b w:val="false"/>
-                <w:u w:val="none"/>
-                <w:strike w:val="false"/>
-                <w:sz w:val="16"/>
-                <w:szCs w:val="16"/>
-                <w:color w:val="000000"/>
-              </w:rPr>
-              <w:t xml:space="preserve">0.978</w:t>
-            </w:r>
-          </w:p>
-        </w:tc>
-        <w:tc>
-          <w:tcPr>
-            <w:tcBorders>
-              <w:bottom w:val="none" w:sz="0" w:space="0" w:color="000000"/>
-              <w:top w:val="none" w:sz="0" w:space="0" w:color="000000"/>
-              <w:left w:val="none" w:sz="0" w:space="0" w:color="000000"/>
-              <w:right w:val="none" w:sz="0" w:space="0" w:color="000000"/>
-            </w:tcBorders>
-            <w:shd w:val="clear" w:color="auto" w:fill="FFFFFF"/>
-            <w:tcMar>
-              <w:top w:w="0" w:type="dxa"/>
-              <w:bottom w:w="0" w:type="dxa"/>
-              <w:left w:w="0" w:type="dxa"/>
-              <w:right w:w="0" w:type="dxa"/>
-            </w:tcMar>
-            <w:vAlign w:val="center"/>
-          </w:tcPr>
-          <w:p>
-            <w:pPr>
-              <w:jc w:val="center"/>
-              <w:pBdr>
-                <w:bottom w:val="none" w:sz="0" w:space="0" w:color="000000"/>
-                <w:top w:val="none" w:sz="0" w:space="0" w:color="000000"/>
-                <w:left w:val="none" w:sz="0" w:space="0" w:color="000000"/>
-                <w:right w:val="none" w:sz="0" w:space="0" w:color="000000"/>
-              </w:pBdr>
-              <w:spacing w:after="60" w:before="60" w:line="240"/>
-              <w:ind w:left="60" w:right="60" w:firstLine="0" w:firstLineChars="0"/>
-              <w:rPr>
-                <w:rFonts w:ascii="Calibri" w:hAnsi="Calibri" w:eastAsia="Calibri" w:cs="Calibri"/>
-                <w:i w:val="false"/>
-                <w:b w:val="false"/>
-                <w:u w:val="none"/>
-                <w:strike w:val="false"/>
-                <w:sz w:val="16"/>
-                <w:szCs w:val="16"/>
-                <w:color w:val="000000"/>
-              </w:rPr>
-            </w:pPr>
-            <w:r>
-              <w:rPr>
-                <w:rFonts w:ascii="Calibri" w:hAnsi="Calibri" w:eastAsia="Calibri" w:cs="Calibri"/>
-                <w:i w:val="false"/>
-                <w:b w:val="false"/>
-                <w:u w:val="none"/>
-                <w:strike w:val="false"/>
-                <w:sz w:val="16"/>
-                <w:szCs w:val="16"/>
-                <w:color w:val="000000"/>
-              </w:rPr>
-              <w:t xml:space="preserve">0.976</w:t>
-            </w:r>
-          </w:p>
-        </w:tc>
-        <w:tc>
-          <w:tcPr>
-            <w:tcBorders>
-              <w:bottom w:val="none" w:sz="0" w:space="0" w:color="000000"/>
-              <w:top w:val="none" w:sz="0" w:space="0" w:color="000000"/>
-              <w:left w:val="none" w:sz="0" w:space="0" w:color="000000"/>
-              <w:right w:val="none" w:sz="0" w:space="0" w:color="000000"/>
-            </w:tcBorders>
-            <w:shd w:val="clear" w:color="auto" w:fill="FFFFFF"/>
-            <w:tcMar>
-              <w:top w:w="0" w:type="dxa"/>
-              <w:bottom w:w="0" w:type="dxa"/>
-              <w:left w:w="0" w:type="dxa"/>
-              <w:right w:w="0" w:type="dxa"/>
-            </w:tcMar>
-            <w:vAlign w:val="center"/>
-          </w:tcPr>
-          <w:p>
-            <w:pPr>
-              <w:jc w:val="center"/>
-              <w:pBdr>
-                <w:bottom w:val="none" w:sz="0" w:space="0" w:color="000000"/>
-                <w:top w:val="none" w:sz="0" w:space="0" w:color="000000"/>
-                <w:left w:val="none" w:sz="0" w:space="0" w:color="000000"/>
-                <w:right w:val="none" w:sz="0" w:space="0" w:color="000000"/>
-              </w:pBdr>
-              <w:spacing w:after="60" w:before="60" w:line="240"/>
-              <w:ind w:left="60" w:right="60" w:firstLine="0" w:firstLineChars="0"/>
-              <w:rPr>
-                <w:rFonts w:ascii="Calibri" w:hAnsi="Calibri" w:eastAsia="Calibri" w:cs="Calibri"/>
-                <w:i w:val="false"/>
-                <w:b w:val="false"/>
-                <w:u w:val="none"/>
-                <w:strike w:val="false"/>
-                <w:sz w:val="16"/>
-                <w:szCs w:val="16"/>
-                <w:color w:val="000000"/>
-              </w:rPr>
-            </w:pPr>
-            <w:r>
-              <w:rPr>
-                <w:rFonts w:ascii="Calibri" w:hAnsi="Calibri" w:eastAsia="Calibri" w:cs="Calibri"/>
-                <w:i w:val="false"/>
-                <w:b w:val="false"/>
-                <w:u w:val="none"/>
-                <w:strike w:val="false"/>
-                <w:sz w:val="16"/>
-                <w:szCs w:val="16"/>
-                <w:color w:val="000000"/>
-              </w:rPr>
-              <w:t xml:space="preserve">0.091</w:t>
-            </w:r>
-          </w:p>
-        </w:tc>
-        <w:tc>
-          <w:tcPr>
-            <w:tcBorders>
-              <w:bottom w:val="none" w:sz="0" w:space="0" w:color="000000"/>
-              <w:top w:val="none" w:sz="0" w:space="0" w:color="000000"/>
-              <w:left w:val="none" w:sz="0" w:space="0" w:color="000000"/>
-              <w:right w:val="none" w:sz="0" w:space="0" w:color="000000"/>
-            </w:tcBorders>
-            <w:shd w:val="clear" w:color="auto" w:fill="FFFFFF"/>
-            <w:tcMar>
-              <w:top w:w="0" w:type="dxa"/>
-              <w:bottom w:w="0" w:type="dxa"/>
-              <w:left w:w="0" w:type="dxa"/>
-              <w:right w:w="0" w:type="dxa"/>
-            </w:tcMar>
-            <w:vAlign w:val="center"/>
-          </w:tcPr>
-          <w:p>
-            <w:pPr>
-              <w:jc w:val="center"/>
-              <w:pBdr>
-                <w:bottom w:val="none" w:sz="0" w:space="0" w:color="000000"/>
-                <w:top w:val="none" w:sz="0" w:space="0" w:color="000000"/>
-                <w:left w:val="none" w:sz="0" w:space="0" w:color="000000"/>
-                <w:right w:val="none" w:sz="0" w:space="0" w:color="000000"/>
-              </w:pBdr>
-              <w:spacing w:after="60" w:before="60" w:line="240"/>
-              <w:ind w:left="60" w:right="60" w:firstLine="0" w:firstLineChars="0"/>
-              <w:rPr>
-                <w:rFonts w:ascii="Calibri" w:hAnsi="Calibri" w:eastAsia="Calibri" w:cs="Calibri"/>
-                <w:i w:val="false"/>
-                <w:b w:val="false"/>
-                <w:u w:val="none"/>
-                <w:strike w:val="false"/>
-                <w:sz w:val="16"/>
-                <w:szCs w:val="16"/>
-                <w:color w:val="000000"/>
-              </w:rPr>
-            </w:pPr>
-            <w:r>
-              <w:rPr>
-                <w:rFonts w:ascii="Calibri" w:hAnsi="Calibri" w:eastAsia="Calibri" w:cs="Calibri"/>
-                <w:i w:val="false"/>
-                <w:b w:val="false"/>
-                <w:u w:val="none"/>
-                <w:strike w:val="false"/>
-                <w:sz w:val="16"/>
-                <w:szCs w:val="16"/>
-                <w:color w:val="000000"/>
-              </w:rPr>
-              <w:t xml:space="preserve">0.079</w:t>
-            </w:r>
-          </w:p>
-        </w:tc>
-        <w:tc>
-          <w:tcPr>
-            <w:tcBorders>
-              <w:bottom w:val="none" w:sz="0" w:space="0" w:color="000000"/>
-              <w:top w:val="none" w:sz="0" w:space="0" w:color="000000"/>
-              <w:left w:val="none" w:sz="0" w:space="0" w:color="000000"/>
-              <w:right w:val="none" w:sz="0" w:space="0" w:color="000000"/>
-            </w:tcBorders>
-            <w:shd w:val="clear" w:color="auto" w:fill="FFFFFF"/>
-            <w:tcMar>
-              <w:top w:w="0" w:type="dxa"/>
-              <w:bottom w:w="0" w:type="dxa"/>
-              <w:left w:w="0" w:type="dxa"/>
-              <w:right w:w="0" w:type="dxa"/>
-            </w:tcMar>
-            <w:vAlign w:val="center"/>
-          </w:tcPr>
-          <w:p>
-            <w:pPr>
-              <w:jc w:val="center"/>
-              <w:pBdr>
-                <w:bottom w:val="none" w:sz="0" w:space="0" w:color="000000"/>
-                <w:top w:val="none" w:sz="0" w:space="0" w:color="000000"/>
-                <w:left w:val="none" w:sz="0" w:space="0" w:color="000000"/>
-                <w:right w:val="none" w:sz="0" w:space="0" w:color="000000"/>
-              </w:pBdr>
-              <w:spacing w:after="60" w:before="60" w:line="240"/>
-              <w:ind w:left="60" w:right="60" w:firstLine="0" w:firstLineChars="0"/>
-              <w:rPr>
-                <w:rFonts w:ascii="Calibri" w:hAnsi="Calibri" w:eastAsia="Calibri" w:cs="Calibri"/>
-                <w:i w:val="false"/>
-                <w:b w:val="false"/>
-                <w:u w:val="none"/>
-                <w:strike w:val="false"/>
-                <w:sz w:val="16"/>
-                <w:szCs w:val="16"/>
-                <w:color w:val="000000"/>
-              </w:rPr>
-            </w:pPr>
-            <w:r>
-              <w:rPr>
-                <w:rFonts w:ascii="Calibri" w:hAnsi="Calibri" w:eastAsia="Calibri" w:cs="Calibri"/>
-                <w:i w:val="false"/>
-                <w:b w:val="false"/>
-                <w:u w:val="none"/>
-                <w:strike w:val="false"/>
-                <w:sz w:val="16"/>
-                <w:szCs w:val="16"/>
-                <w:color w:val="000000"/>
-              </w:rPr>
-              <w:t xml:space="preserve">3,421</w:t>
-            </w:r>
-          </w:p>
-        </w:tc>
-        <w:tc>
-          <w:tcPr>
-            <w:tcBorders>
-              <w:bottom w:val="none" w:sz="0" w:space="0" w:color="000000"/>
-              <w:top w:val="none" w:sz="0" w:space="0" w:color="000000"/>
-              <w:left w:val="none" w:sz="0" w:space="0" w:color="000000"/>
-              <w:right w:val="none" w:sz="0" w:space="0" w:color="000000"/>
-            </w:tcBorders>
-            <w:shd w:val="clear" w:color="auto" w:fill="FFFFFF"/>
-            <w:tcMar>
-              <w:top w:w="0" w:type="dxa"/>
-              <w:bottom w:w="0" w:type="dxa"/>
-              <w:left w:w="0" w:type="dxa"/>
-              <w:right w:w="0" w:type="dxa"/>
-            </w:tcMar>
-            <w:vAlign w:val="center"/>
-          </w:tcPr>
-          <w:p>
-            <w:pPr>
-              <w:jc w:val="center"/>
-              <w:pBdr>
-                <w:bottom w:val="none" w:sz="0" w:space="0" w:color="000000"/>
-                <w:top w:val="none" w:sz="0" w:space="0" w:color="000000"/>
-                <w:left w:val="none" w:sz="0" w:space="0" w:color="000000"/>
-                <w:right w:val="none" w:sz="0" w:space="0" w:color="000000"/>
-              </w:pBdr>
-              <w:spacing w:after="60" w:before="60" w:line="240"/>
-              <w:ind w:left="60" w:right="60" w:firstLine="0" w:firstLineChars="0"/>
-              <w:rPr>
-                <w:rFonts w:ascii="Calibri" w:hAnsi="Calibri" w:eastAsia="Calibri" w:cs="Calibri"/>
-                <w:i w:val="false"/>
-                <w:b w:val="false"/>
-                <w:u w:val="none"/>
-                <w:strike w:val="false"/>
-                <w:sz w:val="16"/>
-                <w:szCs w:val="16"/>
-                <w:color w:val="000000"/>
-              </w:rPr>
-            </w:pPr>
-            <w:r>
-              <w:rPr>
-                <w:rFonts w:ascii="Calibri" w:hAnsi="Calibri" w:eastAsia="Calibri" w:cs="Calibri"/>
-                <w:i w:val="false"/>
-                <w:b w:val="false"/>
-                <w:u w:val="none"/>
-                <w:strike w:val="false"/>
-                <w:sz w:val="16"/>
-                <w:szCs w:val="16"/>
-                <w:color w:val="000000"/>
-              </w:rPr>
-              <w:t xml:space="preserve">189</w:t>
+              <w:t xml:space="preserve">17,690</w:t>
+            </w:r>
+          </w:p>
+        </w:tc>
+        <w:tc>
+          <w:tcPr>
+            <w:tcBorders>
+              <w:bottom w:val="none" w:sz="0" w:space="0" w:color="000000"/>
+              <w:top w:val="none" w:sz="0" w:space="0" w:color="000000"/>
+              <w:left w:val="none" w:sz="0" w:space="0" w:color="000000"/>
+              <w:right w:val="none" w:sz="0" w:space="0" w:color="000000"/>
+            </w:tcBorders>
+            <w:shd w:val="clear" w:color="auto" w:fill="FFFFFF"/>
+            <w:tcMar>
+              <w:top w:w="0" w:type="dxa"/>
+              <w:bottom w:w="0" w:type="dxa"/>
+              <w:left w:w="0" w:type="dxa"/>
+              <w:right w:w="0" w:type="dxa"/>
+            </w:tcMar>
+            <w:vAlign w:val="center"/>
+          </w:tcPr>
+          <w:p>
+            <w:pPr>
+              <w:jc w:val="center"/>
+              <w:pBdr>
+                <w:bottom w:val="none" w:sz="0" w:space="0" w:color="000000"/>
+                <w:top w:val="none" w:sz="0" w:space="0" w:color="000000"/>
+                <w:left w:val="none" w:sz="0" w:space="0" w:color="000000"/>
+                <w:right w:val="none" w:sz="0" w:space="0" w:color="000000"/>
+              </w:pBdr>
+              <w:spacing w:after="60" w:before="60" w:line="240"/>
+              <w:ind w:left="60" w:right="60" w:firstLine="0" w:firstLineChars="0"/>
+              <w:rPr>
+                <w:rFonts w:ascii="Calibri" w:hAnsi="Calibri" w:eastAsia="Calibri" w:cs="Calibri"/>
+                <w:i w:val="false"/>
+                <w:b w:val="false"/>
+                <w:u w:val="none"/>
+                <w:strike w:val="false"/>
+                <w:sz w:val="16"/>
+                <w:szCs w:val="16"/>
+                <w:color w:val="000000"/>
+              </w:rPr>
+            </w:pPr>
+            <w:r>
+              <w:rPr>
+                <w:rFonts w:ascii="Calibri" w:hAnsi="Calibri" w:eastAsia="Calibri" w:cs="Calibri"/>
+                <w:i w:val="false"/>
+                <w:b w:val="false"/>
+                <w:u w:val="none"/>
+                <w:strike w:val="false"/>
+                <w:sz w:val="16"/>
+                <w:szCs w:val="16"/>
+                <w:color w:val="000000"/>
+              </w:rPr>
+              <w:t xml:space="preserve">719</w:t>
+            </w:r>
+          </w:p>
+        </w:tc>
+        <w:tc>
+          <w:tcPr>
+            <w:tcBorders>
+              <w:bottom w:val="none" w:sz="0" w:space="0" w:color="000000"/>
+              <w:top w:val="none" w:sz="0" w:space="0" w:color="000000"/>
+              <w:left w:val="none" w:sz="0" w:space="0" w:color="000000"/>
+              <w:right w:val="none" w:sz="0" w:space="0" w:color="000000"/>
+            </w:tcBorders>
+            <w:shd w:val="clear" w:color="auto" w:fill="FFFFFF"/>
+            <w:tcMar>
+              <w:top w:w="0" w:type="dxa"/>
+              <w:bottom w:w="0" w:type="dxa"/>
+              <w:left w:w="0" w:type="dxa"/>
+              <w:right w:w="0" w:type="dxa"/>
+            </w:tcMar>
+            <w:vAlign w:val="center"/>
+          </w:tcPr>
+          <w:p>
+            <w:pPr>
+              <w:jc w:val="center"/>
+              <w:pBdr>
+                <w:bottom w:val="none" w:sz="0" w:space="0" w:color="000000"/>
+                <w:top w:val="none" w:sz="0" w:space="0" w:color="000000"/>
+                <w:left w:val="none" w:sz="0" w:space="0" w:color="000000"/>
+                <w:right w:val="none" w:sz="0" w:space="0" w:color="000000"/>
+              </w:pBdr>
+              <w:spacing w:after="60" w:before="60" w:line="240"/>
+              <w:ind w:left="60" w:right="60" w:firstLine="0" w:firstLineChars="0"/>
+              <w:rPr>
+                <w:rFonts w:ascii="Calibri" w:hAnsi="Calibri" w:eastAsia="Calibri" w:cs="Calibri"/>
+                <w:i w:val="false"/>
+                <w:b w:val="false"/>
+                <w:u w:val="none"/>
+                <w:strike w:val="false"/>
+                <w:sz w:val="16"/>
+                <w:szCs w:val="16"/>
+                <w:color w:val="000000"/>
+              </w:rPr>
+            </w:pPr>
+            <w:r>
+              <w:rPr>
+                <w:rFonts w:ascii="Calibri" w:hAnsi="Calibri" w:eastAsia="Calibri" w:cs="Calibri"/>
+                <w:i w:val="false"/>
+                <w:b w:val="false"/>
+                <w:u w:val="none"/>
+                <w:strike w:val="false"/>
+                <w:sz w:val="16"/>
+                <w:szCs w:val="16"/>
+                <w:color w:val="000000"/>
+              </w:rPr>
+              <w:t xml:space="preserve">0.985</w:t>
+            </w:r>
+          </w:p>
+        </w:tc>
+        <w:tc>
+          <w:tcPr>
+            <w:tcBorders>
+              <w:bottom w:val="none" w:sz="0" w:space="0" w:color="000000"/>
+              <w:top w:val="none" w:sz="0" w:space="0" w:color="000000"/>
+              <w:left w:val="none" w:sz="0" w:space="0" w:color="000000"/>
+              <w:right w:val="none" w:sz="0" w:space="0" w:color="000000"/>
+            </w:tcBorders>
+            <w:shd w:val="clear" w:color="auto" w:fill="FFFFFF"/>
+            <w:tcMar>
+              <w:top w:w="0" w:type="dxa"/>
+              <w:bottom w:w="0" w:type="dxa"/>
+              <w:left w:w="0" w:type="dxa"/>
+              <w:right w:w="0" w:type="dxa"/>
+            </w:tcMar>
+            <w:vAlign w:val="center"/>
+          </w:tcPr>
+          <w:p>
+            <w:pPr>
+              <w:jc w:val="center"/>
+              <w:pBdr>
+                <w:bottom w:val="none" w:sz="0" w:space="0" w:color="000000"/>
+                <w:top w:val="none" w:sz="0" w:space="0" w:color="000000"/>
+                <w:left w:val="none" w:sz="0" w:space="0" w:color="000000"/>
+                <w:right w:val="none" w:sz="0" w:space="0" w:color="000000"/>
+              </w:pBdr>
+              <w:spacing w:after="60" w:before="60" w:line="240"/>
+              <w:ind w:left="60" w:right="60" w:firstLine="0" w:firstLineChars="0"/>
+              <w:rPr>
+                <w:rFonts w:ascii="Calibri" w:hAnsi="Calibri" w:eastAsia="Calibri" w:cs="Calibri"/>
+                <w:i w:val="false"/>
+                <w:b w:val="false"/>
+                <w:u w:val="none"/>
+                <w:strike w:val="false"/>
+                <w:sz w:val="16"/>
+                <w:szCs w:val="16"/>
+                <w:color w:val="000000"/>
+              </w:rPr>
+            </w:pPr>
+            <w:r>
+              <w:rPr>
+                <w:rFonts w:ascii="Calibri" w:hAnsi="Calibri" w:eastAsia="Calibri" w:cs="Calibri"/>
+                <w:i w:val="false"/>
+                <w:b w:val="false"/>
+                <w:u w:val="none"/>
+                <w:strike w:val="false"/>
+                <w:sz w:val="16"/>
+                <w:szCs w:val="16"/>
+                <w:color w:val="000000"/>
+              </w:rPr>
+              <w:t xml:space="preserve">0.983</w:t>
+            </w:r>
+          </w:p>
+        </w:tc>
+        <w:tc>
+          <w:tcPr>
+            <w:tcBorders>
+              <w:bottom w:val="none" w:sz="0" w:space="0" w:color="000000"/>
+              <w:top w:val="none" w:sz="0" w:space="0" w:color="000000"/>
+              <w:left w:val="none" w:sz="0" w:space="0" w:color="000000"/>
+              <w:right w:val="none" w:sz="0" w:space="0" w:color="000000"/>
+            </w:tcBorders>
+            <w:shd w:val="clear" w:color="auto" w:fill="FFFFFF"/>
+            <w:tcMar>
+              <w:top w:w="0" w:type="dxa"/>
+              <w:bottom w:w="0" w:type="dxa"/>
+              <w:left w:w="0" w:type="dxa"/>
+              <w:right w:w="0" w:type="dxa"/>
+            </w:tcMar>
+            <w:vAlign w:val="center"/>
+          </w:tcPr>
+          <w:p>
+            <w:pPr>
+              <w:jc w:val="center"/>
+              <w:pBdr>
+                <w:bottom w:val="none" w:sz="0" w:space="0" w:color="000000"/>
+                <w:top w:val="none" w:sz="0" w:space="0" w:color="000000"/>
+                <w:left w:val="none" w:sz="0" w:space="0" w:color="000000"/>
+                <w:right w:val="none" w:sz="0" w:space="0" w:color="000000"/>
+              </w:pBdr>
+              <w:spacing w:after="60" w:before="60" w:line="240"/>
+              <w:ind w:left="60" w:right="60" w:firstLine="0" w:firstLineChars="0"/>
+              <w:rPr>
+                <w:rFonts w:ascii="Calibri" w:hAnsi="Calibri" w:eastAsia="Calibri" w:cs="Calibri"/>
+                <w:i w:val="false"/>
+                <w:b w:val="false"/>
+                <w:u w:val="none"/>
+                <w:strike w:val="false"/>
+                <w:sz w:val="16"/>
+                <w:szCs w:val="16"/>
+                <w:color w:val="000000"/>
+              </w:rPr>
+            </w:pPr>
+            <w:r>
+              <w:rPr>
+                <w:rFonts w:ascii="Calibri" w:hAnsi="Calibri" w:eastAsia="Calibri" w:cs="Calibri"/>
+                <w:i w:val="false"/>
+                <w:b w:val="false"/>
+                <w:u w:val="none"/>
+                <w:strike w:val="false"/>
+                <w:sz w:val="16"/>
+                <w:szCs w:val="16"/>
+                <w:color w:val="000000"/>
+              </w:rPr>
+              <w:t xml:space="preserve">0.082</w:t>
+            </w:r>
+          </w:p>
+        </w:tc>
+        <w:tc>
+          <w:tcPr>
+            <w:tcBorders>
+              <w:bottom w:val="none" w:sz="0" w:space="0" w:color="000000"/>
+              <w:top w:val="none" w:sz="0" w:space="0" w:color="000000"/>
+              <w:left w:val="none" w:sz="0" w:space="0" w:color="000000"/>
+              <w:right w:val="none" w:sz="0" w:space="0" w:color="000000"/>
+            </w:tcBorders>
+            <w:shd w:val="clear" w:color="auto" w:fill="FFFFFF"/>
+            <w:tcMar>
+              <w:top w:w="0" w:type="dxa"/>
+              <w:bottom w:w="0" w:type="dxa"/>
+              <w:left w:w="0" w:type="dxa"/>
+              <w:right w:w="0" w:type="dxa"/>
+            </w:tcMar>
+            <w:vAlign w:val="center"/>
+          </w:tcPr>
+          <w:p>
+            <w:pPr>
+              <w:jc w:val="center"/>
+              <w:pBdr>
+                <w:bottom w:val="none" w:sz="0" w:space="0" w:color="000000"/>
+                <w:top w:val="none" w:sz="0" w:space="0" w:color="000000"/>
+                <w:left w:val="none" w:sz="0" w:space="0" w:color="000000"/>
+                <w:right w:val="none" w:sz="0" w:space="0" w:color="000000"/>
+              </w:pBdr>
+              <w:spacing w:after="60" w:before="60" w:line="240"/>
+              <w:ind w:left="60" w:right="60" w:firstLine="0" w:firstLineChars="0"/>
+              <w:rPr>
+                <w:rFonts w:ascii="Calibri" w:hAnsi="Calibri" w:eastAsia="Calibri" w:cs="Calibri"/>
+                <w:i w:val="false"/>
+                <w:b w:val="false"/>
+                <w:u w:val="none"/>
+                <w:strike w:val="false"/>
+                <w:sz w:val="16"/>
+                <w:szCs w:val="16"/>
+                <w:color w:val="000000"/>
+              </w:rPr>
+            </w:pPr>
+            <w:r>
+              <w:rPr>
+                <w:rFonts w:ascii="Calibri" w:hAnsi="Calibri" w:eastAsia="Calibri" w:cs="Calibri"/>
+                <w:i w:val="false"/>
+                <w:b w:val="false"/>
+                <w:u w:val="none"/>
+                <w:strike w:val="false"/>
+                <w:sz w:val="16"/>
+                <w:szCs w:val="16"/>
+                <w:color w:val="000000"/>
+              </w:rPr>
+              <w:t xml:space="preserve">0.069</w:t>
+            </w:r>
+          </w:p>
+        </w:tc>
+        <w:tc>
+          <w:tcPr>
+            <w:tcBorders>
+              <w:bottom w:val="none" w:sz="0" w:space="0" w:color="000000"/>
+              <w:top w:val="none" w:sz="0" w:space="0" w:color="000000"/>
+              <w:left w:val="none" w:sz="0" w:space="0" w:color="000000"/>
+              <w:right w:val="none" w:sz="0" w:space="0" w:color="000000"/>
+            </w:tcBorders>
+            <w:shd w:val="clear" w:color="auto" w:fill="FFFFFF"/>
+            <w:tcMar>
+              <w:top w:w="0" w:type="dxa"/>
+              <w:bottom w:w="0" w:type="dxa"/>
+              <w:left w:w="0" w:type="dxa"/>
+              <w:right w:w="0" w:type="dxa"/>
+            </w:tcMar>
+            <w:vAlign w:val="center"/>
+          </w:tcPr>
+          <w:p>
+            <w:pPr>
+              <w:jc w:val="center"/>
+              <w:pBdr>
+                <w:bottom w:val="none" w:sz="0" w:space="0" w:color="000000"/>
+                <w:top w:val="none" w:sz="0" w:space="0" w:color="000000"/>
+                <w:left w:val="none" w:sz="0" w:space="0" w:color="000000"/>
+                <w:right w:val="none" w:sz="0" w:space="0" w:color="000000"/>
+              </w:pBdr>
+              <w:spacing w:after="60" w:before="60" w:line="240"/>
+              <w:ind w:left="60" w:right="60" w:firstLine="0" w:firstLineChars="0"/>
+              <w:rPr>
+                <w:rFonts w:ascii="Calibri" w:hAnsi="Calibri" w:eastAsia="Calibri" w:cs="Calibri"/>
+                <w:i w:val="false"/>
+                <w:b w:val="false"/>
+                <w:u w:val="none"/>
+                <w:strike w:val="false"/>
+                <w:sz w:val="16"/>
+                <w:szCs w:val="16"/>
+                <w:color w:val="000000"/>
+              </w:rPr>
+            </w:pPr>
+            <w:r>
+              <w:rPr>
+                <w:rFonts w:ascii="Calibri" w:hAnsi="Calibri" w:eastAsia="Calibri" w:cs="Calibri"/>
+                <w:i w:val="false"/>
+                <w:b w:val="false"/>
+                <w:u w:val="none"/>
+                <w:strike w:val="false"/>
+                <w:sz w:val="16"/>
+                <w:szCs w:val="16"/>
+                <w:color w:val="000000"/>
+              </w:rPr>
+              <w:t xml:space="preserve">2,417</w:t>
+            </w:r>
+          </w:p>
+        </w:tc>
+        <w:tc>
+          <w:tcPr>
+            <w:tcBorders>
+              <w:bottom w:val="none" w:sz="0" w:space="0" w:color="000000"/>
+              <w:top w:val="none" w:sz="0" w:space="0" w:color="000000"/>
+              <w:left w:val="none" w:sz="0" w:space="0" w:color="000000"/>
+              <w:right w:val="none" w:sz="0" w:space="0" w:color="000000"/>
+            </w:tcBorders>
+            <w:shd w:val="clear" w:color="auto" w:fill="FFFFFF"/>
+            <w:tcMar>
+              <w:top w:w="0" w:type="dxa"/>
+              <w:bottom w:w="0" w:type="dxa"/>
+              <w:left w:w="0" w:type="dxa"/>
+              <w:right w:w="0" w:type="dxa"/>
+            </w:tcMar>
+            <w:vAlign w:val="center"/>
+          </w:tcPr>
+          <w:p>
+            <w:pPr>
+              <w:jc w:val="center"/>
+              <w:pBdr>
+                <w:bottom w:val="none" w:sz="0" w:space="0" w:color="000000"/>
+                <w:top w:val="none" w:sz="0" w:space="0" w:color="000000"/>
+                <w:left w:val="none" w:sz="0" w:space="0" w:color="000000"/>
+                <w:right w:val="none" w:sz="0" w:space="0" w:color="000000"/>
+              </w:pBdr>
+              <w:spacing w:after="60" w:before="60" w:line="240"/>
+              <w:ind w:left="60" w:right="60" w:firstLine="0" w:firstLineChars="0"/>
+              <w:rPr>
+                <w:rFonts w:ascii="Calibri" w:hAnsi="Calibri" w:eastAsia="Calibri" w:cs="Calibri"/>
+                <w:i w:val="false"/>
+                <w:b w:val="false"/>
+                <w:u w:val="none"/>
+                <w:strike w:val="false"/>
+                <w:sz w:val="16"/>
+                <w:szCs w:val="16"/>
+                <w:color w:val="000000"/>
+              </w:rPr>
+            </w:pPr>
+            <w:r>
+              <w:rPr>
+                <w:rFonts w:ascii="Calibri" w:hAnsi="Calibri" w:eastAsia="Calibri" w:cs="Calibri"/>
+                <w:i w:val="false"/>
+                <w:b w:val="false"/>
+                <w:u w:val="none"/>
+                <w:strike w:val="false"/>
+                <w:sz w:val="16"/>
+                <w:szCs w:val="16"/>
+                <w:color w:val="000000"/>
+              </w:rPr>
+              <w:t xml:space="preserve">147</w:t>
             </w:r>
           </w:p>
         </w:tc>
@@ -4607,7 +4607,7 @@
       </w:tr>
       <w:tr>
         <w:trPr>
-          <w:trHeight w:val="296" w:hRule="auto"/>
+          <w:trHeight w:val="297" w:hRule="auto"/>
         </w:trPr>
         body6
         <w:tc>
@@ -4768,7 +4768,7 @@
                 <w:szCs w:val="16"/>
                 <w:color w:val="000000"/>
               </w:rPr>
-              <w:t xml:space="preserve">47,237</w:t>
+              <w:t xml:space="preserve">26,254</w:t>
             </w:r>
           </w:p>
         </w:tc>
@@ -4822,7 +4822,7 @@
                 <w:szCs w:val="16"/>
                 <w:color w:val="000000"/>
               </w:rPr>
-              <w:t xml:space="preserve">1,555</w:t>
+              <w:t xml:space="preserve">1,055</w:t>
             </w:r>
           </w:p>
         </w:tc>
@@ -4876,7 +4876,7 @@
                 <w:szCs w:val="16"/>
                 <w:color w:val="000000"/>
               </w:rPr>
-              <w:t xml:space="preserve">0.968</w:t>
+              <w:t xml:space="preserve">0.977</w:t>
             </w:r>
           </w:p>
         </w:tc>
@@ -4930,7 +4930,7 @@
                 <w:szCs w:val="16"/>
                 <w:color w:val="000000"/>
               </w:rPr>
-              <w:t xml:space="preserve">0.975</w:t>
+              <w:t xml:space="preserve">0.983</w:t>
             </w:r>
           </w:p>
         </w:tc>
@@ -4984,7 +4984,7 @@
                 <w:szCs w:val="16"/>
                 <w:color w:val="000000"/>
               </w:rPr>
-              <w:t xml:space="preserve">0.093</w:t>
+              <w:t xml:space="preserve">0.083</w:t>
             </w:r>
           </w:p>
         </w:tc>
@@ -5038,7 +5038,7 @@
                 <w:szCs w:val="16"/>
                 <w:color w:val="000000"/>
               </w:rPr>
-              <w:t xml:space="preserve">0.077</w:t>
+              <w:t xml:space="preserve">0.067</w:t>
             </w:r>
           </w:p>
         </w:tc>
@@ -5092,7 +5092,7 @@
                 <w:szCs w:val="16"/>
                 <w:color w:val="000000"/>
               </w:rPr>
-              <w:t xml:space="preserve">14,477</w:t>
+              <w:t xml:space="preserve">8,564</w:t>
             </w:r>
           </w:p>
         </w:tc>
@@ -5146,7 +5146,7 @@
                 <w:szCs w:val="16"/>
                 <w:color w:val="000000"/>
               </w:rPr>
-              <w:t xml:space="preserve">420</w:t>
+              <w:t xml:space="preserve">336</w:t>
             </w:r>
           </w:p>
         </w:tc>
@@ -5200,7 +5200,7 @@
                 <w:szCs w:val="16"/>
                 <w:color w:val="8B0000"/>
               </w:rPr>
-              <w:t xml:space="preserve">-0.010</w:t>
+              <w:t xml:space="preserve">-0.007</w:t>
             </w:r>
           </w:p>
         </w:tc>

</xml_diff>

<commit_message>
Avances resultados (en español por ahora) y especificación de pairwise en todos los modelos (lavaan por defecto estaba usando listwise)
</commit_message>
<xml_diff>
--- a/output/figures/tables/invariance_table_country.docx
+++ b/output/figures/tables/invariance_table_country.docx
@@ -958,7 +958,7 @@
                 <w:szCs w:val="16"/>
                 <w:color w:val="000000"/>
               </w:rPr>
-              <w:t xml:space="preserve">14,965</w:t>
+              <w:t xml:space="preserve">21,351</w:t>
             </w:r>
           </w:p>
         </w:tc>
@@ -1066,7 +1066,7 @@
                 <w:szCs w:val="16"/>
                 <w:color w:val="000000"/>
               </w:rPr>
-              <w:t xml:space="preserve">0.998</w:t>
+              <w:t xml:space="preserve">0.997</w:t>
             </w:r>
           </w:p>
         </w:tc>
@@ -1120,7 +1120,7 @@
                 <w:szCs w:val="16"/>
                 <w:color w:val="000000"/>
               </w:rPr>
-              <w:t xml:space="preserve">0.997</w:t>
+              <w:t xml:space="preserve">0.996</w:t>
             </w:r>
           </w:p>
         </w:tc>
@@ -1174,7 +1174,7 @@
                 <w:szCs w:val="16"/>
                 <w:color w:val="000000"/>
               </w:rPr>
-              <w:t xml:space="preserve">0.067</w:t>
+              <w:t xml:space="preserve">0.073</w:t>
             </w:r>
           </w:p>
         </w:tc>
@@ -1228,7 +1228,7 @@
                 <w:szCs w:val="16"/>
                 <w:color w:val="000000"/>
               </w:rPr>
-              <w:t xml:space="preserve">0.045</w:t>
+              <w:t xml:space="preserve">0.051</w:t>
             </w:r>
           </w:p>
         </w:tc>
@@ -1559,7 +1559,7 @@
       </w:tr>
       <w:tr>
         <w:trPr>
-          <w:trHeight w:val="296" w:hRule="auto"/>
+          <w:trHeight w:val="297" w:hRule="auto"/>
         </w:trPr>
         body2
         <w:tc>
@@ -1720,7 +1720,7 @@
                 <w:szCs w:val="16"/>
                 <w:color w:val="000000"/>
               </w:rPr>
-              <w:t xml:space="preserve">16,696</w:t>
+              <w:t xml:space="preserve">23,059</w:t>
             </w:r>
           </w:p>
         </w:tc>
@@ -1828,223 +1828,223 @@
                 <w:szCs w:val="16"/>
                 <w:color w:val="000000"/>
               </w:rPr>
-              <w:t xml:space="preserve">0.998</w:t>
-            </w:r>
-          </w:p>
-        </w:tc>
-        <w:tc>
-          <w:tcPr>
-            <w:tcBorders>
-              <w:bottom w:val="none" w:sz="0" w:space="0" w:color="000000"/>
-              <w:top w:val="none" w:sz="0" w:space="0" w:color="000000"/>
-              <w:left w:val="none" w:sz="0" w:space="0" w:color="000000"/>
-              <w:right w:val="none" w:sz="0" w:space="0" w:color="000000"/>
-            </w:tcBorders>
-            <w:shd w:val="clear" w:color="auto" w:fill="FFFFFF"/>
-            <w:tcMar>
-              <w:top w:w="0" w:type="dxa"/>
-              <w:bottom w:w="0" w:type="dxa"/>
-              <w:left w:w="0" w:type="dxa"/>
-              <w:right w:w="0" w:type="dxa"/>
-            </w:tcMar>
-            <w:vAlign w:val="center"/>
-          </w:tcPr>
-          <w:p>
-            <w:pPr>
-              <w:jc w:val="center"/>
-              <w:pBdr>
-                <w:bottom w:val="none" w:sz="0" w:space="0" w:color="000000"/>
-                <w:top w:val="none" w:sz="0" w:space="0" w:color="000000"/>
-                <w:left w:val="none" w:sz="0" w:space="0" w:color="000000"/>
-                <w:right w:val="none" w:sz="0" w:space="0" w:color="000000"/>
-              </w:pBdr>
-              <w:spacing w:after="60" w:before="60" w:line="240"/>
-              <w:ind w:left="60" w:right="60" w:firstLine="0" w:firstLineChars="0"/>
-              <w:rPr>
-                <w:rFonts w:ascii="Calibri" w:hAnsi="Calibri" w:eastAsia="Calibri" w:cs="Calibri"/>
-                <w:i w:val="false"/>
-                <w:b w:val="false"/>
-                <w:u w:val="none"/>
-                <w:strike w:val="false"/>
-                <w:sz w:val="16"/>
-                <w:szCs w:val="16"/>
-                <w:color w:val="000000"/>
-              </w:rPr>
-            </w:pPr>
-            <w:r>
-              <w:rPr>
-                <w:rFonts w:ascii="Calibri" w:hAnsi="Calibri" w:eastAsia="Calibri" w:cs="Calibri"/>
-                <w:i w:val="false"/>
-                <w:b w:val="false"/>
-                <w:u w:val="none"/>
-                <w:strike w:val="false"/>
-                <w:sz w:val="16"/>
-                <w:szCs w:val="16"/>
-                <w:color w:val="000000"/>
-              </w:rPr>
-              <w:t xml:space="preserve">0.998</w:t>
-            </w:r>
-          </w:p>
-        </w:tc>
-        <w:tc>
-          <w:tcPr>
-            <w:tcBorders>
-              <w:bottom w:val="none" w:sz="0" w:space="0" w:color="000000"/>
-              <w:top w:val="none" w:sz="0" w:space="0" w:color="000000"/>
-              <w:left w:val="none" w:sz="0" w:space="0" w:color="000000"/>
-              <w:right w:val="none" w:sz="0" w:space="0" w:color="000000"/>
-            </w:tcBorders>
-            <w:shd w:val="clear" w:color="auto" w:fill="FFFFFF"/>
-            <w:tcMar>
-              <w:top w:w="0" w:type="dxa"/>
-              <w:bottom w:w="0" w:type="dxa"/>
-              <w:left w:w="0" w:type="dxa"/>
-              <w:right w:w="0" w:type="dxa"/>
-            </w:tcMar>
-            <w:vAlign w:val="center"/>
-          </w:tcPr>
-          <w:p>
-            <w:pPr>
-              <w:jc w:val="center"/>
-              <w:pBdr>
-                <w:bottom w:val="none" w:sz="0" w:space="0" w:color="000000"/>
-                <w:top w:val="none" w:sz="0" w:space="0" w:color="000000"/>
-                <w:left w:val="none" w:sz="0" w:space="0" w:color="000000"/>
-                <w:right w:val="none" w:sz="0" w:space="0" w:color="000000"/>
-              </w:pBdr>
-              <w:spacing w:after="60" w:before="60" w:line="240"/>
-              <w:ind w:left="60" w:right="60" w:firstLine="0" w:firstLineChars="0"/>
-              <w:rPr>
-                <w:rFonts w:ascii="Calibri" w:hAnsi="Calibri" w:eastAsia="Calibri" w:cs="Calibri"/>
-                <w:i w:val="false"/>
-                <w:b w:val="false"/>
-                <w:u w:val="none"/>
-                <w:strike w:val="false"/>
-                <w:sz w:val="16"/>
-                <w:szCs w:val="16"/>
-                <w:color w:val="000000"/>
-              </w:rPr>
-            </w:pPr>
-            <w:r>
-              <w:rPr>
-                <w:rFonts w:ascii="Calibri" w:hAnsi="Calibri" w:eastAsia="Calibri" w:cs="Calibri"/>
-                <w:i w:val="false"/>
-                <w:b w:val="false"/>
-                <w:u w:val="none"/>
-                <w:strike w:val="false"/>
-                <w:sz w:val="16"/>
-                <w:szCs w:val="16"/>
-                <w:color w:val="000000"/>
-              </w:rPr>
-              <w:t xml:space="preserve">0.063</w:t>
-            </w:r>
-          </w:p>
-        </w:tc>
-        <w:tc>
-          <w:tcPr>
-            <w:tcBorders>
-              <w:bottom w:val="none" w:sz="0" w:space="0" w:color="000000"/>
-              <w:top w:val="none" w:sz="0" w:space="0" w:color="000000"/>
-              <w:left w:val="none" w:sz="0" w:space="0" w:color="000000"/>
-              <w:right w:val="none" w:sz="0" w:space="0" w:color="000000"/>
-            </w:tcBorders>
-            <w:shd w:val="clear" w:color="auto" w:fill="FFFFFF"/>
-            <w:tcMar>
-              <w:top w:w="0" w:type="dxa"/>
-              <w:bottom w:w="0" w:type="dxa"/>
-              <w:left w:w="0" w:type="dxa"/>
-              <w:right w:w="0" w:type="dxa"/>
-            </w:tcMar>
-            <w:vAlign w:val="center"/>
-          </w:tcPr>
-          <w:p>
-            <w:pPr>
-              <w:jc w:val="center"/>
-              <w:pBdr>
-                <w:bottom w:val="none" w:sz="0" w:space="0" w:color="000000"/>
-                <w:top w:val="none" w:sz="0" w:space="0" w:color="000000"/>
-                <w:left w:val="none" w:sz="0" w:space="0" w:color="000000"/>
-                <w:right w:val="none" w:sz="0" w:space="0" w:color="000000"/>
-              </w:pBdr>
-              <w:spacing w:after="60" w:before="60" w:line="240"/>
-              <w:ind w:left="60" w:right="60" w:firstLine="0" w:firstLineChars="0"/>
-              <w:rPr>
-                <w:rFonts w:ascii="Calibri" w:hAnsi="Calibri" w:eastAsia="Calibri" w:cs="Calibri"/>
-                <w:i w:val="false"/>
-                <w:b w:val="false"/>
-                <w:u w:val="none"/>
-                <w:strike w:val="false"/>
-                <w:sz w:val="16"/>
-                <w:szCs w:val="16"/>
-                <w:color w:val="000000"/>
-              </w:rPr>
-            </w:pPr>
-            <w:r>
-              <w:rPr>
-                <w:rFonts w:ascii="Calibri" w:hAnsi="Calibri" w:eastAsia="Calibri" w:cs="Calibri"/>
-                <w:i w:val="false"/>
-                <w:b w:val="false"/>
-                <w:u w:val="none"/>
-                <w:strike w:val="false"/>
-                <w:sz w:val="16"/>
-                <w:szCs w:val="16"/>
-                <w:color w:val="000000"/>
-              </w:rPr>
-              <w:t xml:space="preserve">0.046</w:t>
-            </w:r>
-          </w:p>
-        </w:tc>
-        <w:tc>
-          <w:tcPr>
-            <w:tcBorders>
-              <w:bottom w:val="none" w:sz="0" w:space="0" w:color="000000"/>
-              <w:top w:val="none" w:sz="0" w:space="0" w:color="000000"/>
-              <w:left w:val="none" w:sz="0" w:space="0" w:color="000000"/>
-              <w:right w:val="none" w:sz="0" w:space="0" w:color="000000"/>
-            </w:tcBorders>
-            <w:shd w:val="clear" w:color="auto" w:fill="FFFFFF"/>
-            <w:tcMar>
-              <w:top w:w="0" w:type="dxa"/>
-              <w:bottom w:w="0" w:type="dxa"/>
-              <w:left w:w="0" w:type="dxa"/>
-              <w:right w:w="0" w:type="dxa"/>
-            </w:tcMar>
-            <w:vAlign w:val="center"/>
-          </w:tcPr>
-          <w:p>
-            <w:pPr>
-              <w:jc w:val="center"/>
-              <w:pBdr>
-                <w:bottom w:val="none" w:sz="0" w:space="0" w:color="000000"/>
-                <w:top w:val="none" w:sz="0" w:space="0" w:color="000000"/>
-                <w:left w:val="none" w:sz="0" w:space="0" w:color="000000"/>
-                <w:right w:val="none" w:sz="0" w:space="0" w:color="000000"/>
-              </w:pBdr>
-              <w:spacing w:after="60" w:before="60" w:line="240"/>
-              <w:ind w:left="60" w:right="60" w:firstLine="0" w:firstLineChars="0"/>
-              <w:rPr>
-                <w:rFonts w:ascii="Calibri" w:hAnsi="Calibri" w:eastAsia="Calibri" w:cs="Calibri"/>
-                <w:i w:val="false"/>
-                <w:b w:val="false"/>
-                <w:u w:val="none"/>
-                <w:strike w:val="false"/>
-                <w:sz w:val="16"/>
-                <w:szCs w:val="16"/>
-                <w:color w:val="000000"/>
-              </w:rPr>
-            </w:pPr>
-            <w:r>
-              <w:rPr>
-                <w:rFonts w:ascii="Calibri" w:hAnsi="Calibri" w:eastAsia="Calibri" w:cs="Calibri"/>
-                <w:i w:val="false"/>
-                <w:b w:val="false"/>
-                <w:u w:val="none"/>
-                <w:strike w:val="false"/>
-                <w:sz w:val="16"/>
-                <w:szCs w:val="16"/>
-                <w:color w:val="000000"/>
-              </w:rPr>
-              <w:t xml:space="preserve">1,731</w:t>
+              <w:t xml:space="preserve">0.997</w:t>
+            </w:r>
+          </w:p>
+        </w:tc>
+        <w:tc>
+          <w:tcPr>
+            <w:tcBorders>
+              <w:bottom w:val="none" w:sz="0" w:space="0" w:color="000000"/>
+              <w:top w:val="none" w:sz="0" w:space="0" w:color="000000"/>
+              <w:left w:val="none" w:sz="0" w:space="0" w:color="000000"/>
+              <w:right w:val="none" w:sz="0" w:space="0" w:color="000000"/>
+            </w:tcBorders>
+            <w:shd w:val="clear" w:color="auto" w:fill="FFFFFF"/>
+            <w:tcMar>
+              <w:top w:w="0" w:type="dxa"/>
+              <w:bottom w:w="0" w:type="dxa"/>
+              <w:left w:w="0" w:type="dxa"/>
+              <w:right w:w="0" w:type="dxa"/>
+            </w:tcMar>
+            <w:vAlign w:val="center"/>
+          </w:tcPr>
+          <w:p>
+            <w:pPr>
+              <w:jc w:val="center"/>
+              <w:pBdr>
+                <w:bottom w:val="none" w:sz="0" w:space="0" w:color="000000"/>
+                <w:top w:val="none" w:sz="0" w:space="0" w:color="000000"/>
+                <w:left w:val="none" w:sz="0" w:space="0" w:color="000000"/>
+                <w:right w:val="none" w:sz="0" w:space="0" w:color="000000"/>
+              </w:pBdr>
+              <w:spacing w:after="60" w:before="60" w:line="240"/>
+              <w:ind w:left="60" w:right="60" w:firstLine="0" w:firstLineChars="0"/>
+              <w:rPr>
+                <w:rFonts w:ascii="Calibri" w:hAnsi="Calibri" w:eastAsia="Calibri" w:cs="Calibri"/>
+                <w:i w:val="false"/>
+                <w:b w:val="false"/>
+                <w:u w:val="none"/>
+                <w:strike w:val="false"/>
+                <w:sz w:val="16"/>
+                <w:szCs w:val="16"/>
+                <w:color w:val="000000"/>
+              </w:rPr>
+            </w:pPr>
+            <w:r>
+              <w:rPr>
+                <w:rFonts w:ascii="Calibri" w:hAnsi="Calibri" w:eastAsia="Calibri" w:cs="Calibri"/>
+                <w:i w:val="false"/>
+                <w:b w:val="false"/>
+                <w:u w:val="none"/>
+                <w:strike w:val="false"/>
+                <w:sz w:val="16"/>
+                <w:szCs w:val="16"/>
+                <w:color w:val="000000"/>
+              </w:rPr>
+              <w:t xml:space="preserve">0.997</w:t>
+            </w:r>
+          </w:p>
+        </w:tc>
+        <w:tc>
+          <w:tcPr>
+            <w:tcBorders>
+              <w:bottom w:val="none" w:sz="0" w:space="0" w:color="000000"/>
+              <w:top w:val="none" w:sz="0" w:space="0" w:color="000000"/>
+              <w:left w:val="none" w:sz="0" w:space="0" w:color="000000"/>
+              <w:right w:val="none" w:sz="0" w:space="0" w:color="000000"/>
+            </w:tcBorders>
+            <w:shd w:val="clear" w:color="auto" w:fill="FFFFFF"/>
+            <w:tcMar>
+              <w:top w:w="0" w:type="dxa"/>
+              <w:bottom w:w="0" w:type="dxa"/>
+              <w:left w:w="0" w:type="dxa"/>
+              <w:right w:w="0" w:type="dxa"/>
+            </w:tcMar>
+            <w:vAlign w:val="center"/>
+          </w:tcPr>
+          <w:p>
+            <w:pPr>
+              <w:jc w:val="center"/>
+              <w:pBdr>
+                <w:bottom w:val="none" w:sz="0" w:space="0" w:color="000000"/>
+                <w:top w:val="none" w:sz="0" w:space="0" w:color="000000"/>
+                <w:left w:val="none" w:sz="0" w:space="0" w:color="000000"/>
+                <w:right w:val="none" w:sz="0" w:space="0" w:color="000000"/>
+              </w:pBdr>
+              <w:spacing w:after="60" w:before="60" w:line="240"/>
+              <w:ind w:left="60" w:right="60" w:firstLine="0" w:firstLineChars="0"/>
+              <w:rPr>
+                <w:rFonts w:ascii="Calibri" w:hAnsi="Calibri" w:eastAsia="Calibri" w:cs="Calibri"/>
+                <w:i w:val="false"/>
+                <w:b w:val="false"/>
+                <w:u w:val="none"/>
+                <w:strike w:val="false"/>
+                <w:sz w:val="16"/>
+                <w:szCs w:val="16"/>
+                <w:color w:val="000000"/>
+              </w:rPr>
+            </w:pPr>
+            <w:r>
+              <w:rPr>
+                <w:rFonts w:ascii="Calibri" w:hAnsi="Calibri" w:eastAsia="Calibri" w:cs="Calibri"/>
+                <w:i w:val="false"/>
+                <w:b w:val="false"/>
+                <w:u w:val="none"/>
+                <w:strike w:val="false"/>
+                <w:sz w:val="16"/>
+                <w:szCs w:val="16"/>
+                <w:color w:val="000000"/>
+              </w:rPr>
+              <w:t xml:space="preserve">0.067</w:t>
+            </w:r>
+          </w:p>
+        </w:tc>
+        <w:tc>
+          <w:tcPr>
+            <w:tcBorders>
+              <w:bottom w:val="none" w:sz="0" w:space="0" w:color="000000"/>
+              <w:top w:val="none" w:sz="0" w:space="0" w:color="000000"/>
+              <w:left w:val="none" w:sz="0" w:space="0" w:color="000000"/>
+              <w:right w:val="none" w:sz="0" w:space="0" w:color="000000"/>
+            </w:tcBorders>
+            <w:shd w:val="clear" w:color="auto" w:fill="FFFFFF"/>
+            <w:tcMar>
+              <w:top w:w="0" w:type="dxa"/>
+              <w:bottom w:w="0" w:type="dxa"/>
+              <w:left w:w="0" w:type="dxa"/>
+              <w:right w:w="0" w:type="dxa"/>
+            </w:tcMar>
+            <w:vAlign w:val="center"/>
+          </w:tcPr>
+          <w:p>
+            <w:pPr>
+              <w:jc w:val="center"/>
+              <w:pBdr>
+                <w:bottom w:val="none" w:sz="0" w:space="0" w:color="000000"/>
+                <w:top w:val="none" w:sz="0" w:space="0" w:color="000000"/>
+                <w:left w:val="none" w:sz="0" w:space="0" w:color="000000"/>
+                <w:right w:val="none" w:sz="0" w:space="0" w:color="000000"/>
+              </w:pBdr>
+              <w:spacing w:after="60" w:before="60" w:line="240"/>
+              <w:ind w:left="60" w:right="60" w:firstLine="0" w:firstLineChars="0"/>
+              <w:rPr>
+                <w:rFonts w:ascii="Calibri" w:hAnsi="Calibri" w:eastAsia="Calibri" w:cs="Calibri"/>
+                <w:i w:val="false"/>
+                <w:b w:val="false"/>
+                <w:u w:val="none"/>
+                <w:strike w:val="false"/>
+                <w:sz w:val="16"/>
+                <w:szCs w:val="16"/>
+                <w:color w:val="000000"/>
+              </w:rPr>
+            </w:pPr>
+            <w:r>
+              <w:rPr>
+                <w:rFonts w:ascii="Calibri" w:hAnsi="Calibri" w:eastAsia="Calibri" w:cs="Calibri"/>
+                <w:i w:val="false"/>
+                <w:b w:val="false"/>
+                <w:u w:val="none"/>
+                <w:strike w:val="false"/>
+                <w:sz w:val="16"/>
+                <w:szCs w:val="16"/>
+                <w:color w:val="000000"/>
+              </w:rPr>
+              <w:t xml:space="preserve">0.051</w:t>
+            </w:r>
+          </w:p>
+        </w:tc>
+        <w:tc>
+          <w:tcPr>
+            <w:tcBorders>
+              <w:bottom w:val="none" w:sz="0" w:space="0" w:color="000000"/>
+              <w:top w:val="none" w:sz="0" w:space="0" w:color="000000"/>
+              <w:left w:val="none" w:sz="0" w:space="0" w:color="000000"/>
+              <w:right w:val="none" w:sz="0" w:space="0" w:color="000000"/>
+            </w:tcBorders>
+            <w:shd w:val="clear" w:color="auto" w:fill="FFFFFF"/>
+            <w:tcMar>
+              <w:top w:w="0" w:type="dxa"/>
+              <w:bottom w:w="0" w:type="dxa"/>
+              <w:left w:w="0" w:type="dxa"/>
+              <w:right w:w="0" w:type="dxa"/>
+            </w:tcMar>
+            <w:vAlign w:val="center"/>
+          </w:tcPr>
+          <w:p>
+            <w:pPr>
+              <w:jc w:val="center"/>
+              <w:pBdr>
+                <w:bottom w:val="none" w:sz="0" w:space="0" w:color="000000"/>
+                <w:top w:val="none" w:sz="0" w:space="0" w:color="000000"/>
+                <w:left w:val="none" w:sz="0" w:space="0" w:color="000000"/>
+                <w:right w:val="none" w:sz="0" w:space="0" w:color="000000"/>
+              </w:pBdr>
+              <w:spacing w:after="60" w:before="60" w:line="240"/>
+              <w:ind w:left="60" w:right="60" w:firstLine="0" w:firstLineChars="0"/>
+              <w:rPr>
+                <w:rFonts w:ascii="Calibri" w:hAnsi="Calibri" w:eastAsia="Calibri" w:cs="Calibri"/>
+                <w:i w:val="false"/>
+                <w:b w:val="false"/>
+                <w:u w:val="none"/>
+                <w:strike w:val="false"/>
+                <w:sz w:val="16"/>
+                <w:szCs w:val="16"/>
+                <w:color w:val="000000"/>
+              </w:rPr>
+            </w:pPr>
+            <w:r>
+              <w:rPr>
+                <w:rFonts w:ascii="Calibri" w:hAnsi="Calibri" w:eastAsia="Calibri" w:cs="Calibri"/>
+                <w:i w:val="false"/>
+                <w:b w:val="false"/>
+                <w:u w:val="none"/>
+                <w:strike w:val="false"/>
+                <w:sz w:val="16"/>
+                <w:szCs w:val="16"/>
+                <w:color w:val="000000"/>
+              </w:rPr>
+              <w:t xml:space="preserve">1,709</w:t>
             </w:r>
           </w:p>
         </w:tc>
@@ -2482,7 +2482,7 @@
                 <w:szCs w:val="16"/>
                 <w:color w:val="000000"/>
               </w:rPr>
-              <w:t xml:space="preserve">19,817</w:t>
+              <w:t xml:space="preserve">27,039</w:t>
             </w:r>
           </w:p>
         </w:tc>
@@ -2590,223 +2590,223 @@
                 <w:szCs w:val="16"/>
                 <w:color w:val="000000"/>
               </w:rPr>
-              <w:t xml:space="preserve">0.998</w:t>
-            </w:r>
-          </w:p>
-        </w:tc>
-        <w:tc>
-          <w:tcPr>
-            <w:tcBorders>
-              <w:bottom w:val="none" w:sz="0" w:space="0" w:color="000000"/>
-              <w:top w:val="none" w:sz="0" w:space="0" w:color="000000"/>
-              <w:left w:val="none" w:sz="0" w:space="0" w:color="000000"/>
-              <w:right w:val="none" w:sz="0" w:space="0" w:color="000000"/>
-            </w:tcBorders>
-            <w:shd w:val="clear" w:color="auto" w:fill="FFFFFF"/>
-            <w:tcMar>
-              <w:top w:w="0" w:type="dxa"/>
-              <w:bottom w:w="0" w:type="dxa"/>
-              <w:left w:w="0" w:type="dxa"/>
-              <w:right w:w="0" w:type="dxa"/>
-            </w:tcMar>
-            <w:vAlign w:val="center"/>
-          </w:tcPr>
-          <w:p>
-            <w:pPr>
-              <w:jc w:val="center"/>
-              <w:pBdr>
-                <w:bottom w:val="none" w:sz="0" w:space="0" w:color="000000"/>
-                <w:top w:val="none" w:sz="0" w:space="0" w:color="000000"/>
-                <w:left w:val="none" w:sz="0" w:space="0" w:color="000000"/>
-                <w:right w:val="none" w:sz="0" w:space="0" w:color="000000"/>
-              </w:pBdr>
-              <w:spacing w:after="60" w:before="60" w:line="240"/>
-              <w:ind w:left="60" w:right="60" w:firstLine="0" w:firstLineChars="0"/>
-              <w:rPr>
-                <w:rFonts w:ascii="Calibri" w:hAnsi="Calibri" w:eastAsia="Calibri" w:cs="Calibri"/>
-                <w:i w:val="false"/>
-                <w:b w:val="false"/>
-                <w:u w:val="none"/>
-                <w:strike w:val="false"/>
-                <w:sz w:val="16"/>
-                <w:szCs w:val="16"/>
-                <w:color w:val="000000"/>
-              </w:rPr>
-            </w:pPr>
-            <w:r>
-              <w:rPr>
-                <w:rFonts w:ascii="Calibri" w:hAnsi="Calibri" w:eastAsia="Calibri" w:cs="Calibri"/>
-                <w:i w:val="false"/>
-                <w:b w:val="false"/>
-                <w:u w:val="none"/>
-                <w:strike w:val="false"/>
-                <w:sz w:val="16"/>
-                <w:szCs w:val="16"/>
-                <w:color w:val="000000"/>
-              </w:rPr>
-              <w:t xml:space="preserve">0.998</w:t>
-            </w:r>
-          </w:p>
-        </w:tc>
-        <w:tc>
-          <w:tcPr>
-            <w:tcBorders>
-              <w:bottom w:val="none" w:sz="0" w:space="0" w:color="000000"/>
-              <w:top w:val="none" w:sz="0" w:space="0" w:color="000000"/>
-              <w:left w:val="none" w:sz="0" w:space="0" w:color="000000"/>
-              <w:right w:val="none" w:sz="0" w:space="0" w:color="000000"/>
-            </w:tcBorders>
-            <w:shd w:val="clear" w:color="auto" w:fill="FFFFFF"/>
-            <w:tcMar>
-              <w:top w:w="0" w:type="dxa"/>
-              <w:bottom w:w="0" w:type="dxa"/>
-              <w:left w:w="0" w:type="dxa"/>
-              <w:right w:w="0" w:type="dxa"/>
-            </w:tcMar>
-            <w:vAlign w:val="center"/>
-          </w:tcPr>
-          <w:p>
-            <w:pPr>
-              <w:jc w:val="center"/>
-              <w:pBdr>
-                <w:bottom w:val="none" w:sz="0" w:space="0" w:color="000000"/>
-                <w:top w:val="none" w:sz="0" w:space="0" w:color="000000"/>
-                <w:left w:val="none" w:sz="0" w:space="0" w:color="000000"/>
-                <w:right w:val="none" w:sz="0" w:space="0" w:color="000000"/>
-              </w:pBdr>
-              <w:spacing w:after="60" w:before="60" w:line="240"/>
-              <w:ind w:left="60" w:right="60" w:firstLine="0" w:firstLineChars="0"/>
-              <w:rPr>
-                <w:rFonts w:ascii="Calibri" w:hAnsi="Calibri" w:eastAsia="Calibri" w:cs="Calibri"/>
-                <w:i w:val="false"/>
-                <w:b w:val="false"/>
-                <w:u w:val="none"/>
-                <w:strike w:val="false"/>
-                <w:sz w:val="16"/>
-                <w:szCs w:val="16"/>
-                <w:color w:val="000000"/>
-              </w:rPr>
-            </w:pPr>
-            <w:r>
-              <w:rPr>
-                <w:rFonts w:ascii="Calibri" w:hAnsi="Calibri" w:eastAsia="Calibri" w:cs="Calibri"/>
-                <w:i w:val="false"/>
-                <w:b w:val="false"/>
-                <w:u w:val="none"/>
-                <w:strike w:val="false"/>
-                <w:sz w:val="16"/>
-                <w:szCs w:val="16"/>
-                <w:color w:val="000000"/>
-              </w:rPr>
-              <w:t xml:space="preserve">0.056</w:t>
-            </w:r>
-          </w:p>
-        </w:tc>
-        <w:tc>
-          <w:tcPr>
-            <w:tcBorders>
-              <w:bottom w:val="none" w:sz="0" w:space="0" w:color="000000"/>
-              <w:top w:val="none" w:sz="0" w:space="0" w:color="000000"/>
-              <w:left w:val="none" w:sz="0" w:space="0" w:color="000000"/>
-              <w:right w:val="none" w:sz="0" w:space="0" w:color="000000"/>
-            </w:tcBorders>
-            <w:shd w:val="clear" w:color="auto" w:fill="FFFFFF"/>
-            <w:tcMar>
-              <w:top w:w="0" w:type="dxa"/>
-              <w:bottom w:w="0" w:type="dxa"/>
-              <w:left w:w="0" w:type="dxa"/>
-              <w:right w:w="0" w:type="dxa"/>
-            </w:tcMar>
-            <w:vAlign w:val="center"/>
-          </w:tcPr>
-          <w:p>
-            <w:pPr>
-              <w:jc w:val="center"/>
-              <w:pBdr>
-                <w:bottom w:val="none" w:sz="0" w:space="0" w:color="000000"/>
-                <w:top w:val="none" w:sz="0" w:space="0" w:color="000000"/>
-                <w:left w:val="none" w:sz="0" w:space="0" w:color="000000"/>
-                <w:right w:val="none" w:sz="0" w:space="0" w:color="000000"/>
-              </w:pBdr>
-              <w:spacing w:after="60" w:before="60" w:line="240"/>
-              <w:ind w:left="60" w:right="60" w:firstLine="0" w:firstLineChars="0"/>
-              <w:rPr>
-                <w:rFonts w:ascii="Calibri" w:hAnsi="Calibri" w:eastAsia="Calibri" w:cs="Calibri"/>
-                <w:i w:val="false"/>
-                <w:b w:val="false"/>
-                <w:u w:val="none"/>
-                <w:strike w:val="false"/>
-                <w:sz w:val="16"/>
-                <w:szCs w:val="16"/>
-                <w:color w:val="000000"/>
-              </w:rPr>
-            </w:pPr>
-            <w:r>
-              <w:rPr>
-                <w:rFonts w:ascii="Calibri" w:hAnsi="Calibri" w:eastAsia="Calibri" w:cs="Calibri"/>
-                <w:i w:val="false"/>
-                <w:b w:val="false"/>
-                <w:u w:val="none"/>
-                <w:strike w:val="false"/>
-                <w:sz w:val="16"/>
-                <w:szCs w:val="16"/>
-                <w:color w:val="000000"/>
-              </w:rPr>
-              <w:t xml:space="preserve">0.045</w:t>
-            </w:r>
-          </w:p>
-        </w:tc>
-        <w:tc>
-          <w:tcPr>
-            <w:tcBorders>
-              <w:bottom w:val="none" w:sz="0" w:space="0" w:color="000000"/>
-              <w:top w:val="none" w:sz="0" w:space="0" w:color="000000"/>
-              <w:left w:val="none" w:sz="0" w:space="0" w:color="000000"/>
-              <w:right w:val="none" w:sz="0" w:space="0" w:color="000000"/>
-            </w:tcBorders>
-            <w:shd w:val="clear" w:color="auto" w:fill="FFFFFF"/>
-            <w:tcMar>
-              <w:top w:w="0" w:type="dxa"/>
-              <w:bottom w:w="0" w:type="dxa"/>
-              <w:left w:w="0" w:type="dxa"/>
-              <w:right w:w="0" w:type="dxa"/>
-            </w:tcMar>
-            <w:vAlign w:val="center"/>
-          </w:tcPr>
-          <w:p>
-            <w:pPr>
-              <w:jc w:val="center"/>
-              <w:pBdr>
-                <w:bottom w:val="none" w:sz="0" w:space="0" w:color="000000"/>
-                <w:top w:val="none" w:sz="0" w:space="0" w:color="000000"/>
-                <w:left w:val="none" w:sz="0" w:space="0" w:color="000000"/>
-                <w:right w:val="none" w:sz="0" w:space="0" w:color="000000"/>
-              </w:pBdr>
-              <w:spacing w:after="60" w:before="60" w:line="240"/>
-              <w:ind w:left="60" w:right="60" w:firstLine="0" w:firstLineChars="0"/>
-              <w:rPr>
-                <w:rFonts w:ascii="Calibri" w:hAnsi="Calibri" w:eastAsia="Calibri" w:cs="Calibri"/>
-                <w:i w:val="false"/>
-                <w:b w:val="false"/>
-                <w:u w:val="none"/>
-                <w:strike w:val="false"/>
-                <w:sz w:val="16"/>
-                <w:szCs w:val="16"/>
-                <w:color w:val="000000"/>
-              </w:rPr>
-            </w:pPr>
-            <w:r>
-              <w:rPr>
-                <w:rFonts w:ascii="Calibri" w:hAnsi="Calibri" w:eastAsia="Calibri" w:cs="Calibri"/>
-                <w:i w:val="false"/>
-                <w:b w:val="false"/>
-                <w:u w:val="none"/>
-                <w:strike w:val="false"/>
-                <w:sz w:val="16"/>
-                <w:szCs w:val="16"/>
-                <w:color w:val="000000"/>
-              </w:rPr>
-              <w:t xml:space="preserve">3,121</w:t>
+              <w:t xml:space="preserve">0.996</w:t>
+            </w:r>
+          </w:p>
+        </w:tc>
+        <w:tc>
+          <w:tcPr>
+            <w:tcBorders>
+              <w:bottom w:val="none" w:sz="0" w:space="0" w:color="000000"/>
+              <w:top w:val="none" w:sz="0" w:space="0" w:color="000000"/>
+              <w:left w:val="none" w:sz="0" w:space="0" w:color="000000"/>
+              <w:right w:val="none" w:sz="0" w:space="0" w:color="000000"/>
+            </w:tcBorders>
+            <w:shd w:val="clear" w:color="auto" w:fill="FFFFFF"/>
+            <w:tcMar>
+              <w:top w:w="0" w:type="dxa"/>
+              <w:bottom w:w="0" w:type="dxa"/>
+              <w:left w:w="0" w:type="dxa"/>
+              <w:right w:w="0" w:type="dxa"/>
+            </w:tcMar>
+            <w:vAlign w:val="center"/>
+          </w:tcPr>
+          <w:p>
+            <w:pPr>
+              <w:jc w:val="center"/>
+              <w:pBdr>
+                <w:bottom w:val="none" w:sz="0" w:space="0" w:color="000000"/>
+                <w:top w:val="none" w:sz="0" w:space="0" w:color="000000"/>
+                <w:left w:val="none" w:sz="0" w:space="0" w:color="000000"/>
+                <w:right w:val="none" w:sz="0" w:space="0" w:color="000000"/>
+              </w:pBdr>
+              <w:spacing w:after="60" w:before="60" w:line="240"/>
+              <w:ind w:left="60" w:right="60" w:firstLine="0" w:firstLineChars="0"/>
+              <w:rPr>
+                <w:rFonts w:ascii="Calibri" w:hAnsi="Calibri" w:eastAsia="Calibri" w:cs="Calibri"/>
+                <w:i w:val="false"/>
+                <w:b w:val="false"/>
+                <w:u w:val="none"/>
+                <w:strike w:val="false"/>
+                <w:sz w:val="16"/>
+                <w:szCs w:val="16"/>
+                <w:color w:val="000000"/>
+              </w:rPr>
+            </w:pPr>
+            <w:r>
+              <w:rPr>
+                <w:rFonts w:ascii="Calibri" w:hAnsi="Calibri" w:eastAsia="Calibri" w:cs="Calibri"/>
+                <w:i w:val="false"/>
+                <w:b w:val="false"/>
+                <w:u w:val="none"/>
+                <w:strike w:val="false"/>
+                <w:sz w:val="16"/>
+                <w:szCs w:val="16"/>
+                <w:color w:val="000000"/>
+              </w:rPr>
+              <w:t xml:space="preserve">0.997</w:t>
+            </w:r>
+          </w:p>
+        </w:tc>
+        <w:tc>
+          <w:tcPr>
+            <w:tcBorders>
+              <w:bottom w:val="none" w:sz="0" w:space="0" w:color="000000"/>
+              <w:top w:val="none" w:sz="0" w:space="0" w:color="000000"/>
+              <w:left w:val="none" w:sz="0" w:space="0" w:color="000000"/>
+              <w:right w:val="none" w:sz="0" w:space="0" w:color="000000"/>
+            </w:tcBorders>
+            <w:shd w:val="clear" w:color="auto" w:fill="FFFFFF"/>
+            <w:tcMar>
+              <w:top w:w="0" w:type="dxa"/>
+              <w:bottom w:w="0" w:type="dxa"/>
+              <w:left w:w="0" w:type="dxa"/>
+              <w:right w:w="0" w:type="dxa"/>
+            </w:tcMar>
+            <w:vAlign w:val="center"/>
+          </w:tcPr>
+          <w:p>
+            <w:pPr>
+              <w:jc w:val="center"/>
+              <w:pBdr>
+                <w:bottom w:val="none" w:sz="0" w:space="0" w:color="000000"/>
+                <w:top w:val="none" w:sz="0" w:space="0" w:color="000000"/>
+                <w:left w:val="none" w:sz="0" w:space="0" w:color="000000"/>
+                <w:right w:val="none" w:sz="0" w:space="0" w:color="000000"/>
+              </w:pBdr>
+              <w:spacing w:after="60" w:before="60" w:line="240"/>
+              <w:ind w:left="60" w:right="60" w:firstLine="0" w:firstLineChars="0"/>
+              <w:rPr>
+                <w:rFonts w:ascii="Calibri" w:hAnsi="Calibri" w:eastAsia="Calibri" w:cs="Calibri"/>
+                <w:i w:val="false"/>
+                <w:b w:val="false"/>
+                <w:u w:val="none"/>
+                <w:strike w:val="false"/>
+                <w:sz w:val="16"/>
+                <w:szCs w:val="16"/>
+                <w:color w:val="000000"/>
+              </w:rPr>
+            </w:pPr>
+            <w:r>
+              <w:rPr>
+                <w:rFonts w:ascii="Calibri" w:hAnsi="Calibri" w:eastAsia="Calibri" w:cs="Calibri"/>
+                <w:i w:val="false"/>
+                <w:b w:val="false"/>
+                <w:u w:val="none"/>
+                <w:strike w:val="false"/>
+                <w:sz w:val="16"/>
+                <w:szCs w:val="16"/>
+                <w:color w:val="000000"/>
+              </w:rPr>
+              <w:t xml:space="preserve">0.060</w:t>
+            </w:r>
+          </w:p>
+        </w:tc>
+        <w:tc>
+          <w:tcPr>
+            <w:tcBorders>
+              <w:bottom w:val="none" w:sz="0" w:space="0" w:color="000000"/>
+              <w:top w:val="none" w:sz="0" w:space="0" w:color="000000"/>
+              <w:left w:val="none" w:sz="0" w:space="0" w:color="000000"/>
+              <w:right w:val="none" w:sz="0" w:space="0" w:color="000000"/>
+            </w:tcBorders>
+            <w:shd w:val="clear" w:color="auto" w:fill="FFFFFF"/>
+            <w:tcMar>
+              <w:top w:w="0" w:type="dxa"/>
+              <w:bottom w:w="0" w:type="dxa"/>
+              <w:left w:w="0" w:type="dxa"/>
+              <w:right w:w="0" w:type="dxa"/>
+            </w:tcMar>
+            <w:vAlign w:val="center"/>
+          </w:tcPr>
+          <w:p>
+            <w:pPr>
+              <w:jc w:val="center"/>
+              <w:pBdr>
+                <w:bottom w:val="none" w:sz="0" w:space="0" w:color="000000"/>
+                <w:top w:val="none" w:sz="0" w:space="0" w:color="000000"/>
+                <w:left w:val="none" w:sz="0" w:space="0" w:color="000000"/>
+                <w:right w:val="none" w:sz="0" w:space="0" w:color="000000"/>
+              </w:pBdr>
+              <w:spacing w:after="60" w:before="60" w:line="240"/>
+              <w:ind w:left="60" w:right="60" w:firstLine="0" w:firstLineChars="0"/>
+              <w:rPr>
+                <w:rFonts w:ascii="Calibri" w:hAnsi="Calibri" w:eastAsia="Calibri" w:cs="Calibri"/>
+                <w:i w:val="false"/>
+                <w:b w:val="false"/>
+                <w:u w:val="none"/>
+                <w:strike w:val="false"/>
+                <w:sz w:val="16"/>
+                <w:szCs w:val="16"/>
+                <w:color w:val="000000"/>
+              </w:rPr>
+            </w:pPr>
+            <w:r>
+              <w:rPr>
+                <w:rFonts w:ascii="Calibri" w:hAnsi="Calibri" w:eastAsia="Calibri" w:cs="Calibri"/>
+                <w:i w:val="false"/>
+                <w:b w:val="false"/>
+                <w:u w:val="none"/>
+                <w:strike w:val="false"/>
+                <w:sz w:val="16"/>
+                <w:szCs w:val="16"/>
+                <w:color w:val="000000"/>
+              </w:rPr>
+              <w:t xml:space="preserve">0.051</w:t>
+            </w:r>
+          </w:p>
+        </w:tc>
+        <w:tc>
+          <w:tcPr>
+            <w:tcBorders>
+              <w:bottom w:val="none" w:sz="0" w:space="0" w:color="000000"/>
+              <w:top w:val="none" w:sz="0" w:space="0" w:color="000000"/>
+              <w:left w:val="none" w:sz="0" w:space="0" w:color="000000"/>
+              <w:right w:val="none" w:sz="0" w:space="0" w:color="000000"/>
+            </w:tcBorders>
+            <w:shd w:val="clear" w:color="auto" w:fill="FFFFFF"/>
+            <w:tcMar>
+              <w:top w:w="0" w:type="dxa"/>
+              <w:bottom w:w="0" w:type="dxa"/>
+              <w:left w:w="0" w:type="dxa"/>
+              <w:right w:w="0" w:type="dxa"/>
+            </w:tcMar>
+            <w:vAlign w:val="center"/>
+          </w:tcPr>
+          <w:p>
+            <w:pPr>
+              <w:jc w:val="center"/>
+              <w:pBdr>
+                <w:bottom w:val="none" w:sz="0" w:space="0" w:color="000000"/>
+                <w:top w:val="none" w:sz="0" w:space="0" w:color="000000"/>
+                <w:left w:val="none" w:sz="0" w:space="0" w:color="000000"/>
+                <w:right w:val="none" w:sz="0" w:space="0" w:color="000000"/>
+              </w:pBdr>
+              <w:spacing w:after="60" w:before="60" w:line="240"/>
+              <w:ind w:left="60" w:right="60" w:firstLine="0" w:firstLineChars="0"/>
+              <w:rPr>
+                <w:rFonts w:ascii="Calibri" w:hAnsi="Calibri" w:eastAsia="Calibri" w:cs="Calibri"/>
+                <w:i w:val="false"/>
+                <w:b w:val="false"/>
+                <w:u w:val="none"/>
+                <w:strike w:val="false"/>
+                <w:sz w:val="16"/>
+                <w:szCs w:val="16"/>
+                <w:color w:val="000000"/>
+              </w:rPr>
+            </w:pPr>
+            <w:r>
+              <w:rPr>
+                <w:rFonts w:ascii="Calibri" w:hAnsi="Calibri" w:eastAsia="Calibri" w:cs="Calibri"/>
+                <w:i w:val="false"/>
+                <w:b w:val="false"/>
+                <w:u w:val="none"/>
+                <w:strike w:val="false"/>
+                <w:sz w:val="16"/>
+                <w:szCs w:val="16"/>
+                <w:color w:val="000000"/>
+              </w:rPr>
+              <w:t xml:space="preserve">3,980</w:t>
             </w:r>
           </w:p>
         </w:tc>
@@ -3244,7 +3244,7 @@
                 <w:szCs w:val="16"/>
                 <w:color w:val="000000"/>
               </w:rPr>
-              <w:t xml:space="preserve">15,273</w:t>
+              <w:t xml:space="preserve">16,176</w:t>
             </w:r>
           </w:p>
         </w:tc>
@@ -3406,61 +3406,61 @@
                 <w:szCs w:val="16"/>
                 <w:color w:val="000000"/>
               </w:rPr>
-              <w:t xml:space="preserve">0.982</w:t>
-            </w:r>
-          </w:p>
-        </w:tc>
-        <w:tc>
-          <w:tcPr>
-            <w:tcBorders>
-              <w:bottom w:val="none" w:sz="0" w:space="0" w:color="000000"/>
-              <w:top w:val="none" w:sz="0" w:space="0" w:color="000000"/>
-              <w:left w:val="none" w:sz="0" w:space="0" w:color="000000"/>
-              <w:right w:val="none" w:sz="0" w:space="0" w:color="000000"/>
-            </w:tcBorders>
-            <w:shd w:val="clear" w:color="auto" w:fill="FFFFFF"/>
-            <w:tcMar>
-              <w:top w:w="0" w:type="dxa"/>
-              <w:bottom w:w="0" w:type="dxa"/>
-              <w:left w:w="0" w:type="dxa"/>
-              <w:right w:w="0" w:type="dxa"/>
-            </w:tcMar>
-            <w:vAlign w:val="center"/>
-          </w:tcPr>
-          <w:p>
-            <w:pPr>
-              <w:jc w:val="center"/>
-              <w:pBdr>
-                <w:bottom w:val="none" w:sz="0" w:space="0" w:color="000000"/>
-                <w:top w:val="none" w:sz="0" w:space="0" w:color="000000"/>
-                <w:left w:val="none" w:sz="0" w:space="0" w:color="000000"/>
-                <w:right w:val="none" w:sz="0" w:space="0" w:color="000000"/>
-              </w:pBdr>
-              <w:spacing w:after="60" w:before="60" w:line="240"/>
-              <w:ind w:left="60" w:right="60" w:firstLine="0" w:firstLineChars="0"/>
-              <w:rPr>
-                <w:rFonts w:ascii="Calibri" w:hAnsi="Calibri" w:eastAsia="Calibri" w:cs="Calibri"/>
-                <w:i w:val="false"/>
-                <w:b w:val="false"/>
-                <w:u w:val="none"/>
-                <w:strike w:val="false"/>
-                <w:sz w:val="16"/>
-                <w:szCs w:val="16"/>
-                <w:color w:val="000000"/>
-              </w:rPr>
-            </w:pPr>
-            <w:r>
-              <w:rPr>
-                <w:rFonts w:ascii="Calibri" w:hAnsi="Calibri" w:eastAsia="Calibri" w:cs="Calibri"/>
-                <w:i w:val="false"/>
-                <w:b w:val="false"/>
-                <w:u w:val="none"/>
-                <w:strike w:val="false"/>
-                <w:sz w:val="16"/>
-                <w:szCs w:val="16"/>
-                <w:color w:val="000000"/>
-              </w:rPr>
-              <w:t xml:space="preserve">0.086</w:t>
+              <w:t xml:space="preserve">0.981</w:t>
+            </w:r>
+          </w:p>
+        </w:tc>
+        <w:tc>
+          <w:tcPr>
+            <w:tcBorders>
+              <w:bottom w:val="none" w:sz="0" w:space="0" w:color="000000"/>
+              <w:top w:val="none" w:sz="0" w:space="0" w:color="000000"/>
+              <w:left w:val="none" w:sz="0" w:space="0" w:color="000000"/>
+              <w:right w:val="none" w:sz="0" w:space="0" w:color="000000"/>
+            </w:tcBorders>
+            <w:shd w:val="clear" w:color="auto" w:fill="FFFFFF"/>
+            <w:tcMar>
+              <w:top w:w="0" w:type="dxa"/>
+              <w:bottom w:w="0" w:type="dxa"/>
+              <w:left w:w="0" w:type="dxa"/>
+              <w:right w:w="0" w:type="dxa"/>
+            </w:tcMar>
+            <w:vAlign w:val="center"/>
+          </w:tcPr>
+          <w:p>
+            <w:pPr>
+              <w:jc w:val="center"/>
+              <w:pBdr>
+                <w:bottom w:val="none" w:sz="0" w:space="0" w:color="000000"/>
+                <w:top w:val="none" w:sz="0" w:space="0" w:color="000000"/>
+                <w:left w:val="none" w:sz="0" w:space="0" w:color="000000"/>
+                <w:right w:val="none" w:sz="0" w:space="0" w:color="000000"/>
+              </w:pBdr>
+              <w:spacing w:after="60" w:before="60" w:line="240"/>
+              <w:ind w:left="60" w:right="60" w:firstLine="0" w:firstLineChars="0"/>
+              <w:rPr>
+                <w:rFonts w:ascii="Calibri" w:hAnsi="Calibri" w:eastAsia="Calibri" w:cs="Calibri"/>
+                <w:i w:val="false"/>
+                <w:b w:val="false"/>
+                <w:u w:val="none"/>
+                <w:strike w:val="false"/>
+                <w:sz w:val="16"/>
+                <w:szCs w:val="16"/>
+                <w:color w:val="000000"/>
+              </w:rPr>
+            </w:pPr>
+            <w:r>
+              <w:rPr>
+                <w:rFonts w:ascii="Calibri" w:hAnsi="Calibri" w:eastAsia="Calibri" w:cs="Calibri"/>
+                <w:i w:val="false"/>
+                <w:b w:val="false"/>
+                <w:u w:val="none"/>
+                <w:strike w:val="false"/>
+                <w:sz w:val="16"/>
+                <w:szCs w:val="16"/>
+                <w:color w:val="000000"/>
+              </w:rPr>
+              <w:t xml:space="preserve">0.084</w:t>
             </w:r>
           </w:p>
         </w:tc>
@@ -4006,7 +4006,7 @@
                 <w:szCs w:val="16"/>
                 <w:color w:val="000000"/>
               </w:rPr>
-              <w:t xml:space="preserve">17,690</w:t>
+              <w:t xml:space="preserve">18,802</w:t>
             </w:r>
           </w:p>
         </w:tc>
@@ -4114,7 +4114,7 @@
                 <w:szCs w:val="16"/>
                 <w:color w:val="000000"/>
               </w:rPr>
-              <w:t xml:space="preserve">0.985</w:t>
+              <w:t xml:space="preserve">0.984</w:t>
             </w:r>
           </w:p>
         </w:tc>
@@ -4222,7 +4222,7 @@
                 <w:szCs w:val="16"/>
                 <w:color w:val="000000"/>
               </w:rPr>
-              <w:t xml:space="preserve">0.082</w:t>
+              <w:t xml:space="preserve">0.081</w:t>
             </w:r>
           </w:p>
         </w:tc>
@@ -4330,7 +4330,7 @@
                 <w:szCs w:val="16"/>
                 <w:color w:val="000000"/>
               </w:rPr>
-              <w:t xml:space="preserve">2,417</w:t>
+              <w:t xml:space="preserve">2,627</w:t>
             </w:r>
           </w:p>
         </w:tc>
@@ -4768,7 +4768,7 @@
                 <w:szCs w:val="16"/>
                 <w:color w:val="000000"/>
               </w:rPr>
-              <w:t xml:space="preserve">26,254</w:t>
+              <w:t xml:space="preserve">27,759</w:t>
             </w:r>
           </w:p>
         </w:tc>
@@ -4984,7 +4984,7 @@
                 <w:szCs w:val="16"/>
                 <w:color w:val="000000"/>
               </w:rPr>
-              <w:t xml:space="preserve">0.083</w:t>
+              <w:t xml:space="preserve">0.081</w:t>
             </w:r>
           </w:p>
         </w:tc>
@@ -5092,7 +5092,7 @@
                 <w:szCs w:val="16"/>
                 <w:color w:val="000000"/>
               </w:rPr>
-              <w:t xml:space="preserve">8,564</w:t>
+              <w:t xml:space="preserve">8,956</w:t>
             </w:r>
           </w:p>
         </w:tc>

</xml_diff>